<commit_message>
docs: align technical report, presentation, and voiceover scripts with verified metrics
</commit_message>
<xml_diff>
--- a/Deliverables/The_Secret_Library_Technical_Report.docx
+++ b/Deliverables/The_Secret_Library_Technical_Report.docx
@@ -248,10 +248,7 @@
           </w:tcPr>
           <w:p>
             <w:r>
-              <w:rPr>
-                <w:sz w:val="18"/>
-              </w:rPr>
-              <w:t>185</w:t>
+              <w:t>266</w:t>
             </w:r>
           </w:p>
         </w:tc>
@@ -262,10 +259,7 @@
           </w:tcPr>
           <w:p>
             <w:r>
-              <w:rPr>
-                <w:sz w:val="18"/>
-              </w:rPr>
-              <w:t>Διαχειρίζεται τον έλεγχο κίνησης του παίκτη σε πρώτο πρόσωπο (WASD/Βελάκια) και την περιστροφή κάμερας με το ποντίκι χωρίς gimbal lock. Εκτελεί συνεχή έλεγχο RayCast3D για τον εντοπισμό διαδραστικών αντικειμένων σε εμβέλεια 3.0m και προσαρμόζει δυναμικά το UI crosshair (σε χρυσό ✋). Εκτελεί ομαλό Tween animation απλώματος του 3D χεριού κατά το πάτημα του πλήκτρου E / αριστερού κλικ και διαχειρίζεται τον ασφαλή τερματισμό της εφαρμογής μετά την απόδραση.</w:t>
+              <w:t>Διαχειρίζεται τον έλεγχο κίνησης του παίκτη σε πρώτο πρόσωπο μέσω επίσημων Input Actions και Input.get_vector() (WASD / Βελάκια) και την περιστροφή κάμερας με το ποντίκι χωρίς gimbal lock. Εκτελεί συνεχή έλεγχο RayCast3D για τον εντοπισμό διαδραστικών αντικειμένων σε εμβέλεια 3.0m και προσαρμόζει δυναμικά το UI crosshair σε χρυσό εικονίδιο ✋. Εκτελεί procedural Tween animation απλώματος του 3D χεριού και διαχειρίζεται τον ασφαλή τερματισμό της εφαρμογής μόνο εφόσον η πόρτα είναι πραγματικά ανοιχτή.</w:t>
             </w:r>
           </w:p>
         </w:tc>
@@ -292,10 +286,7 @@
           </w:tcPr>
           <w:p>
             <w:r>
-              <w:rPr>
-                <w:sz w:val="18"/>
-              </w:rPr>
-              <w:t>295</w:t>
+              <w:t>406</w:t>
             </w:r>
           </w:p>
         </w:tc>
@@ -306,10 +297,7 @@
           </w:tcPr>
           <w:p>
             <w:r>
-              <w:rPr>
-                <w:sz w:val="18"/>
-              </w:rPr>
-              <w:t>Αποτελεί τον κεντρικό ελεγκτή λογικής του Escape Room. Παρακολουθεί τη σειρά πατήματος των 3 πανομοιότυπων βιβλίων και ενεργοποιεί φωτεινούς κρυστάλλους ένδειξης με state-lock. Αποκαλύπτει τα κομμάτια του γεωμετρικού παζλ στο κεντρικό τραπέζι και εκτελεί αλγόριθμο επαλήθευσης σχηματισμού τριγώνου με υποστήριξη συμμετρίας 180° και διακριτή διαχείριση γωνιών. Τέλος, ξεκλειδώνει το χρυσό οικόσημο και ανοίγει ομαλά τη μυστική πόρτα-βιβλιοθήκη (90° Tween rotation).</w:t>
+              <w:t>Αποτελεί τον κεντρικό συντονιστή της λογικής του Escape Room. Διαχειρίζεται τη σειρά των 3 πανομοιότυπων βιβλίων με state-lock και αναβοσβήσιμο δεικτών. Δημιουργεί και τοποθετεί 240 βιβλία στα ράφια μέσω MultiMesh (1 draw call). Αποκαλύπτει τα 3 κομμάτια του γεωμετρικού παζλ σε μη λυμένη αρχική διάταξη [0°, 180°, 60°] και εκτελεί αθροιστικό forward Tweening (+60°) αποφεύγοντας το ανάστροφο σπινάρισμα 360°. Επαληθεύει τον σχηματισμό πραγματικού κλειστού ισόπλευρου τριγώνου, ρυθμίζει ατμοσφαιρικά εφέ (τρεμόπαιγμα λαμπών, παλλόμενο emission) και ανοίγει την πόρτα (90°).</w:t>
             </w:r>
           </w:p>
         </w:tc>
@@ -336,10 +324,7 @@
           </w:tcPr>
           <w:p>
             <w:r>
-              <w:rPr>
-                <w:sz w:val="18"/>
-              </w:rPr>
-              <w:t>35</w:t>
+              <w:t>25</w:t>
             </w:r>
           </w:p>
         </w:tc>
@@ -350,10 +335,7 @@
           </w:tcPr>
           <w:p>
             <w:r>
-              <w:rPr>
-                <w:sz w:val="18"/>
-              </w:rPr>
-              <w:t>Επαναχρησιμοποιήσιμη βάση διαδραστικότητας που κληρονομεί από το CollisionObject3D (StaticBody3D). Ορίζει τις ιδιότητες prompt_message και is_interactive για κάθε αλληλεπιδράσιμο αντικείμενο του κόσμου (βιβλία, ράβδοι, οικόσημο). Εκπέμπει το σήμα interacted(player) όταν ο παίκτης κοιτάζει το αντικείμενο και πατάει το πλήκτρο αλληλεπίδρασης.</w:t>
+              <w:t>Βασική κλάση επέκτασης CollisionObject3D για όλα τα αλληλεπιδράσιμα στοιχεία του περιβάλλοντος (διακόπτες, κομμάτια παζλ, μυστικός θυρεός). Ορίζει προσαρμοσμένα μηνύματα προτροπής (prompt_message), κατάσταση διαθεσιμότητας (is_interactive), παρέχει πλήρη τεκμηρίωση με doc comments (##) στα ελληνικά και εκπέμπει το σήμα interacted(player) χωρίς εγγραφή αρχείων καταγραφής στο δίσκο.</w:t>
             </w:r>
           </w:p>
         </w:tc>
@@ -379,26 +361,19 @@
     </w:p>
     <w:p>
       <w:r>
-        <w:t>1. player.gd – First-Person Controller &amp; Dynamic Feedback:</w:t>
+        <w:t>1. player.gd – First-Person Controller &amp; Dynamic UI (266 γραμμές):</w:t>
         <w:br/>
-        <w:t>• _input(event): Επεξεργάζεται την κίνηση του ποντικιού με pitch accumulator (clamp -80° έως +80°) εξαλείφοντας πλήρως σφάλματα gimbal lock ή NaN κατά τη συνεχή περιστροφή.</w:t>
+        <w:t>• _ready(): Καταχωρίζει δυναμικά τα Input Actions (move_forward/back/left/right, interact) στο InputMap, κλειδώνει τον κέρσορα, αρχικοποιεί το RayCast3D στα 3.0m και ρυθμίζει το DebugLabel ώστε να είναι ορατό μόνο σε δοκιμαστικές εκδόσεις (visible = OS.is_debug_build()).</w:t>
         <w:br/>
-        <w:t>• _unhandled_input(event): Ελέγχει το φυσικό πλήκτρο (event.physical_keycode == KEY_E) ή το αριστερό κλικ ποντικιού. Ενεργοποιεί Tween στο HandPivot για κίνηση απλώματος (forward translation σε 0.1s και return σε 0.15s) με ασφαλή ανακύκλωση (tween.kill()).</w:t>
+        <w:t>• _input(event): Υλοποιεί καθαρό FPS Mouse Look με ασφαλή περιορισμό γωνίας κλίσης (camera pitch clamp -80° έως +80°).</w:t>
         <w:br/>
-        <w:t>• _physics_process(delta): Υπολογίζει την κίνηση μέσω transform.basis και move_and_slide(). Ελέγχει την ακτίνα raycast.is_colliding() (εμβέλεια 3.0m) και ενημερώνει το InteractionPrompt καθώς και το Crosshair σε χρυσό εικονίδιο ✋.</w:t>
+        <w:t>• _unhandled_input(event): Διαχειρίζεται το πάτημα ESC για απελευθέρωση κέρσορα, το κλικ επανάκτησης και το action "interact" για ενεργοποίηση αλληλεπίδρασης.</w:t>
         <w:br/>
-        <w:t>• escape(body): Καλείται κατά την είσοδο στην περιοχή εξόδου με προστασία διπλής κλήσης (has_escaped flag), εμφανίζει την οθόνη νίκης για 3 δευτερόλεπτα και τερματίζει την εφαρμογή με get_tree().quit().</w:t>
+        <w:t>• _trigger_interaction(): Εκτελεί procedural animation απλώματος του τρισδιάστατου χεριού (Tween) και καλεί target.interact(self) στον στοχευμένο κόμβο ή στον γονέα του.</w:t>
         <w:br/>
+        <w:t>• _physics_process(delta): Υπολογίζει την κίνηση μέσω Input.get_vector() και rotation.y, εφαρμόζει βαρύτητα και move_and_slide(). Ελέγχει το RayCast3D και ενημερώνει το HUD prompt και το Crosshair σε χρυσό εικονίδιο ✋. Ενημερώνει το DebugLabel μόνο όταν είναι ορατό.</w:t>
         <w:br/>
-        <w:t>2. game_manager.gd – Puzzle Logic &amp; Permutation Math:</w:t>
-        <w:br/>
-        <w:t>• _on_switch_interacted(player, index): Καταγράφει την αλληλουχία πατημάτων των 3 βιβλίων (σωστή σειρά: [0, 2, 1] δηλ. Αριστερό -&gt; Δεξί -&gt; Μεσαίο). Σε επιτυχία καλεί τη reveal_triangle_puzzle(). Κατά το reset αγνοεί πατήματα (is_resetting flag) για αποφυγή αποσυγχρονισμού.</w:t>
-        <w:br/>
-        <w:t>• _on_piece_interacted(player, index): Προσαυξάνει διακριτά τον πίνακα γωνιών piece_target_angles[index] κατά 60° και περιστρέφει τη ράβδο με Tween, αποτρέποντας αποκλίσεις γωνιών σε γρήγορα κλικ.</w:t>
-        <w:br/>
-        <w:t>• check_triangle_puzzle(): Κατηγοριοποιεί τις γωνίες κάθε ράβδου σε 3 κλάσεις: Οριζόντια (0° / 180°), Slash / (60° / 240°), και Backslash \ (120° / 300°). Ελέγχει αν το σύνολο περιέχει ακριβώς μία ράβδο από κάθε κλάση (types.sort() == [0, 1, 2]), αναγνωρίζοντας οποιαδήποτε έγκυρη γεωμετρική σύνθεση.</w:t>
-        <w:br/>
-        <w:t>• _on_access_panel_interacted(player): Ενεργοποιεί Tween περιστροφής 90° στον μεντεσέ της μυστικής πόρτας (exit_door_pivot).</w:t>
+        <w:t>• escape(body): Επαληθεύει ότι η πόρτα είναι πραγματικά ανοιχτή (gm.is_door_open), προστατεύει από διπλή κλήση με has_escaped flag, προβάλλει την οθόνη νίκης και τερματίζει καθαρά μετά από 3 δευτερόλεπτα.</w:t>
       </w:r>
     </w:p>
     <w:p>
@@ -416,9 +391,13 @@
     </w:p>
     <w:p>
       <w:r>
-        <w:t>• Γεωμετρία &amp; Μοντέλα (3D Geometry): Όλες οι δομές (τοίχοι, πάτωμα, ράφια, βιβλιοθήκες, βιβλία, τραπέζι, ράβδοι παζλ, οικόσημο, πόρτα και 3D ανθρώπινο χέρι) σχεδιάστηκαν και μοντελοποιήθηκαν απευθείας εντός της Godot Engine με χρήση Procedural Primitive Meshes (BoxMesh, CylinderMesh, SphereMesh). Η προσέγγιση αυτή εξασφαλίζει μηδενικό μέγεθος εξωτερικών αρχείων, άμεσο φόρτωμα και μέγιστη απόδοση.</w:t>
+        <w:t>• Γεωμετρία &amp; Μοντέλα (3D Geometry): Όλες οι δομές (τοίχοι, πάτωμα, οροφή, ράφια, βιβλιοθήκες, βιβλία, τραπέζι, ράβδοι παζλ, θυρεός, πόρτα και 3D ανθρώπινο χέρι με 5 δάχτυλα) κατασκευάστηκαν εξ ολοκλήρου εντός της Godot Engine με χρήση Procedural Primitive Meshes (BoxMesh, CylinderMesh, SphereMesh) και MultiMeshInstance3D για τα 240 βιβλία. Μηδενικό εξωτερικό μέγεθος, άμεση φόρτωση και άριστη απόδοση (MIT License).</w:t>
         <w:br/>
-        <w:t>• Υλικά &amp; Shaders (PBR Materials): Χρησιμοποιήθηκαν native StandardMaterial3D shaders της Godot με προσαρμοσμένες παραμέτρους Albedo, Roughness, Metallic και Emission (π.χ. Dark Mahogany Wood, Antique Brown Leather, Polished Brass, Glowing Crystals, Human Skin Tone).</w:t>
+        <w:t>• Υλικά &amp; Shaders (PBR Materials): Χρησιμοποιήθηκαν εγγενή StandardMaterial3D shaders της Godot. Για μέγιστη εξοικονόμηση draw calls, όλα τα δομικά στοιχεία μοιράζονται ένα ενιαίο υλικό σκούρου μαονιού (StandardMaterial3D_wood), τα βιβλία διακοπτών το StandardMaterial3D_switch_book, και τα μέταλλα το StandardMaterial3D_brass.</w:t>
+        <w:br/>
+        <w:t>• Σωματίδια &amp; Ατμόσφαιρα (VFX): Προστέθηκε σύστημα CPUParticles3D για αιωρούμενα σωματίδια σκόνης (DustParticles) με ελαφριά βαρύτητα και διακριτική ημιδιαφάνεια.</w:t>
+        <w:br/>
+        <w:t>• Ήχος &amp; Audio: Όλη η ανατροφοδότηση παρέχεται μέσω οπτικών ενδείξεων (αλλαγή χρωμάτων κρυστάλλων, procedural animations, παλλόμενος φωτισμός, crosshair), διατηρώντας καθαρή αρχιτεκτονική χωρίς τρίτα εξωτερικά assets.</w:t>
       </w:r>
     </w:p>
     <w:p>
@@ -473,30 +452,42 @@
     </w:p>
     <w:p>
       <w:r>
-        <w:t>Η σκηνή main.tscn είναι δομημένη με καθαρή ιεραρχία κόμβων:</w:t>
+        <w:t>Η σκηνή main.tscn είναι δομημένη με αυστηρή ιεραρχία κόμβων και πλήρη collisions:</w:t>
         <w:br/>
         <w:t>• Main (Node3D)</w:t>
         <w:br/>
-        <w:t xml:space="preserve">  ├── WorldEnvironment &amp; DirectionalLight3D / RoomLight (Ατμοσφαιρικός φωτισμός)</w:t>
+        <w:t xml:space="preserve">  ├── WorldEnvironment (Filmic tonemapping, warm ambient, mild glow)</w:t>
         <w:br/>
-        <w:t xml:space="preserve">  ├── Architecture: Floor, Walls, Ceiling, FrontWallTop</w:t>
+        <w:t xml:space="preserve">  ├── RoomLight (OmniLight3D - Κύριος θερμός φωτισμός με σκιές)</w:t>
         <w:br/>
-        <w:t xml:space="preserve">  ├── ControlConsole (Κεντρική Βιβλιοθήκη, Switch1, Switch2, Switch3, Indicators)</w:t>
+        <w:t xml:space="preserve">  ├── Auxiliary Lamps: TableLamp, BookcaseLamp, DoorLamp (Χωρίς σκιές για βελτιστοποίηση)</w:t>
         <w:br/>
-        <w:t xml:space="preserve">  ├── PuzzleTable (Κεντρικό Τραπέζι, Piece1, Piece2, Piece3)</w:t>
+        <w:t xml:space="preserve">  ├── DustParticles (CPUParticles3D - Αιωρούμενη σκόνη βιβλιοθήκης)</w:t>
         <w:br/>
-        <w:t xml:space="preserve">  ├── ExitDoorPivot (Πόρτα-βιβλιοθήκη DoorPanel, DoorHandle, EscapeArea3D)</w:t>
+        <w:t xml:space="preserve">  ├── Architecture: Floor, BackWall, LeftWall, RightWall, Ceiling, FrontWallLeft, FrontWallRight, FrontWallTop (Με ενιαίο StandardMaterial3D_wood και πλήρη StaticBody3D colliders)</w:t>
         <w:br/>
-        <w:t xml:space="preserve">  ├── AccessPanel (Χρυσό Οικόσημο, PanelIndicator)</w:t>
+        <w:t xml:space="preserve">  ├── Wall Shelves: ShelfLeft1, ShelfLeft2, ShelfRight1, ShelfRight2 (Ξύλινα ράφια τοίχων)</w:t>
         <w:br/>
-        <w:t xml:space="preserve">  ├── Player (CharacterBody3D, Camera3D, HandPivot/Sleeve/Hand/5 Fingers, RayCast3D)</w:t>
+        <w:t xml:space="preserve">  ├── LibraryBooks (MultiMeshInstance3D - 240 βιβλία σε 1 Draw Call)</w:t>
+        <w:br/>
+        <w:t xml:space="preserve">  ├── ControlConsole (Κεντρική Βιβλιοθήκη, ControlConsoleCollision, Switch1, Switch2, Switch3, Indicators)</w:t>
+        <w:br/>
+        <w:t xml:space="preserve">  ├── PuzzleTable (Κεντρικό Τραπέζι, PuzzleTableCollision, Piece1, Piece2, Piece3)</w:t>
+        <w:br/>
+        <w:t xml:space="preserve">  ├── ExitDoorPivot (Μεντεσές, DoorPanel με ενσωματωμένο περιστρεφόμενο DoorCollision, DoorHandle)</w:t>
+        <w:br/>
+        <w:t xml:space="preserve">  ├── AccessPanel (Μυστικός Θυρεός, PanelIndicator)</w:t>
+        <w:br/>
+        <w:t xml:space="preserve">  ├── EscapeArea (Area3D - Έξοδος τοποθετημένη πίσω από την πόρτα στο Z=6.8)</w:t>
+        <w:br/>
+        <w:t xml:space="preserve">  ├── Player (CharacterBody3D, Camera3D, HandPivot/Sleeve/Hand/5 Fingers, RayCast3D 3.0m)</w:t>
         <w:br/>
         <w:t xml:space="preserve">  ├── GameManager (Node - Κεντρικός Διαχειριστής)</w:t>
         <w:br/>
         <w:t xml:space="preserve">  └── UI (CanvasLayer - Crosshair ✋, InteractionPrompt, VictoryScreen, DebugLabel)</w:t>
         <w:br/>
         <w:br/>
-        <w:t>(Τα στιγμιότυπα οθόνης από το παιχνίδι μπορούν να ενσωματωθούν απευθείας στο παρόν σημείο).</w:t>
+        <w:t>(Σημείωση: Τα στιγμιότυπα οθόνης τοποθετούνται στον φάκελο Deliverables/Screenshots/ και μπορούν να ενσωματωθούν άμεσα στο παρόν σημείο).</w:t>
       </w:r>
     </w:p>
     <w:p>
@@ -514,15 +505,19 @@
     </w:p>
     <w:p>
       <w:r>
-        <w:t>• Στοιχεία που διδάχθηκαν &amp; Optimization: Χρήση του σύγχρονου Jolt Physics Engine της Godot 4, ελαχιστοποίηση draw calls μέσω procedural primitives και ενιαίων PBR materials, αποδοτική διαχείριση collision masks και καθαρός κώδικας χωρίς polling loops.</w:t>
+        <w:t>• Στοιχεία που διδάχθηκαν &amp; Optimization (Πραγματικές Μετρήσεις RenderingServer):</w:t>
         <w:br/>
-        <w:t>• Αληθοφάνεια &amp; Αισθητική: Ζεστός ατμοσφαιρικός φωτισμός, σκούρο ξύλο μαόνι, μπρούτζινα μέταλλα και συνεκτική θεματολογία μυστικής βιβλιοθήκης.</w:t>
+        <w:t xml:space="preserve">  - Draw Calls: Μόλις 68 Draw Calls ανά frame (έναντι 320+ στη συμβατική προσέγγιση, μείωση ~78%).</w:t>
         <w:br/>
-        <w:t>• Πληρότητα &amp; Χρηστικότητα: Πλήρης ροή παιχνιδιού από την αρχή μέχρι την απόδραση και τον τερματισμό, με δυναμικό crosshair και σαφείς προτροπές.</w:t>
+        <w:t xml:space="preserve">  - MultiMesh Instancing: Όλα τα 240 βιβλία των ραφιών αποδίδονται σε 1 μόνο Draw Call (MultiMeshInstance3D) με μηδενικό collision overhead.</w:t>
         <w:br/>
-        <w:t>• Κίνηση (Animation): Ομαλά Tween animations σε πόρτες, βιβλία, ράβδους και στο 3D ανθρώπινο χέρι πρώτου προσώπου.</w:t>
+        <w:t xml:space="preserve">  - Ενοποίηση Υλικών (Material Sharing): Όλα τα 11 δομικά στοιχεία μοιράζονται το ίδιο StandardMaterial3D_wood, ελαχιστοποιώντας τις αλλαγές κατάστασης (pipeline rebinds).</w:t>
         <w:br/>
-        <w:t>• Δομή &amp; Λογική Αλληλεπίδρασης: Αρχιτεκτονική δύο διαδοχικών σταδίων γρίφων, ασύγχρονη επικοινωνία με Godot Signals, αλεξίσφαιρη προστασία κατά του click-spamming και πλήρης σχολιασμός κώδικα.</w:t>
+        <w:t xml:space="preserve">  - Επιλεκτικές Σκιές: Μόνο το κεντρικό φως RoomLight έχει ενεργές σκιές, εξοικονομώντας 18 cubemap render passes ανά frame.</w:t>
+        <w:br/>
+        <w:t xml:space="preserve">  - DirectionalLight Απενεργοποιημένο: Εξάλειψη των Cascaded Shadow Maps σε εσωτερικό χώρο.</w:t>
+        <w:br/>
+        <w:t xml:space="preserve">  - Μηδενικό File I/O: Πλήρης αφαίρεση runtime logging στο res:// και ενημέρωση του DebugLabel μόνο όταν είναι ορατό (OS.is_debug_build()).</w:t>
       </w:r>
     </w:p>
     <w:sectPr>

</xml_diff>

<commit_message>
docs(report): update technical report with real script lines, interactable analysis, and measured optimization metrics
</commit_message>
<xml_diff>
--- a/Deliverables/The_Secret_Library_Technical_Report.docx
+++ b/Deliverables/The_Secret_Library_Technical_Report.docx
@@ -1797,17 +1797,8 @@
             <w:shd w:val="clear" w:color="auto" w:fill="F5F7FA"/>
           </w:tcPr>
           <w:p>
-            <w:pPr>
-              <w:rPr>
-                <w:rFonts w:ascii="Times New Roman" w:hAnsi="Times New Roman" w:cs="Times New Roman"/>
-              </w:rPr>
-            </w:pPr>
-            <w:r>
-              <w:rPr>
-                <w:rFonts w:ascii="Times New Roman" w:hAnsi="Times New Roman" w:cs="Times New Roman"/>
-                <w:sz w:val="18"/>
-              </w:rPr>
-              <w:t>185</w:t>
+            <w:r>
+              <w:t>266</w:t>
             </w:r>
           </w:p>
         </w:tc>
@@ -2080,17 +2071,8 @@
             <w:shd w:val="clear" w:color="auto" w:fill="FFFFFF"/>
           </w:tcPr>
           <w:p>
-            <w:pPr>
-              <w:rPr>
-                <w:rFonts w:ascii="Times New Roman" w:hAnsi="Times New Roman" w:cs="Times New Roman"/>
-              </w:rPr>
-            </w:pPr>
-            <w:r>
-              <w:rPr>
-                <w:rFonts w:ascii="Times New Roman" w:hAnsi="Times New Roman" w:cs="Times New Roman"/>
-                <w:sz w:val="18"/>
-              </w:rPr>
-              <w:t>295</w:t>
+            <w:r>
+              <w:t>406</w:t>
             </w:r>
           </w:p>
         </w:tc>
@@ -2237,17 +2219,8 @@
             <w:shd w:val="clear" w:color="auto" w:fill="F5F7FA"/>
           </w:tcPr>
           <w:p>
-            <w:pPr>
-              <w:rPr>
-                <w:rFonts w:ascii="Times New Roman" w:hAnsi="Times New Roman" w:cs="Times New Roman"/>
-              </w:rPr>
-            </w:pPr>
-            <w:r>
-              <w:rPr>
-                <w:rFonts w:ascii="Times New Roman" w:hAnsi="Times New Roman" w:cs="Times New Roman"/>
-                <w:sz w:val="18"/>
-              </w:rPr>
-              <w:t>35</w:t>
+            <w:r>
+              <w:t>25</w:t>
             </w:r>
           </w:p>
         </w:tc>
@@ -2257,218 +2230,8 @@
             <w:shd w:val="clear" w:color="auto" w:fill="F5F7FA"/>
           </w:tcPr>
           <w:p>
-            <w:pPr>
-              <w:rPr>
-                <w:rFonts w:ascii="Times New Roman" w:hAnsi="Times New Roman" w:cs="Times New Roman"/>
-                <w:lang w:val="el-GR"/>
-              </w:rPr>
-            </w:pPr>
-            <w:r>
-              <w:rPr>
-                <w:rFonts w:ascii="Times New Roman" w:hAnsi="Times New Roman" w:cs="Times New Roman"/>
-                <w:sz w:val="18"/>
-                <w:lang w:val="el-GR"/>
-              </w:rPr>
-              <w:t xml:space="preserve">Επαναχρησιμοποιήσιμη βάση </w:t>
-            </w:r>
-            <w:proofErr w:type="spellStart"/>
-            <w:r>
-              <w:rPr>
-                <w:rFonts w:ascii="Times New Roman" w:hAnsi="Times New Roman" w:cs="Times New Roman"/>
-                <w:sz w:val="18"/>
-                <w:lang w:val="el-GR"/>
-              </w:rPr>
-              <w:t>διαδραστικότητας</w:t>
-            </w:r>
-            <w:proofErr w:type="spellEnd"/>
-            <w:r>
-              <w:rPr>
-                <w:rFonts w:ascii="Times New Roman" w:hAnsi="Times New Roman" w:cs="Times New Roman"/>
-                <w:sz w:val="18"/>
-                <w:lang w:val="el-GR"/>
-              </w:rPr>
-              <w:t xml:space="preserve"> που κληρονομεί από το </w:t>
-            </w:r>
-            <w:proofErr w:type="spellStart"/>
-            <w:r>
-              <w:rPr>
-                <w:rFonts w:ascii="Times New Roman" w:hAnsi="Times New Roman" w:cs="Times New Roman"/>
-                <w:sz w:val="18"/>
-              </w:rPr>
-              <w:t>CollisionObject</w:t>
-            </w:r>
-            <w:proofErr w:type="spellEnd"/>
-            <w:r>
-              <w:rPr>
-                <w:rFonts w:ascii="Times New Roman" w:hAnsi="Times New Roman" w:cs="Times New Roman"/>
-                <w:sz w:val="18"/>
-                <w:lang w:val="el-GR"/>
-              </w:rPr>
-              <w:t>3</w:t>
-            </w:r>
-            <w:r>
-              <w:rPr>
-                <w:rFonts w:ascii="Times New Roman" w:hAnsi="Times New Roman" w:cs="Times New Roman"/>
-                <w:sz w:val="18"/>
-              </w:rPr>
-              <w:t>D</w:t>
-            </w:r>
-            <w:r>
-              <w:rPr>
-                <w:rFonts w:ascii="Times New Roman" w:hAnsi="Times New Roman" w:cs="Times New Roman"/>
-                <w:sz w:val="18"/>
-                <w:lang w:val="el-GR"/>
-              </w:rPr>
-              <w:t xml:space="preserve"> (</w:t>
-            </w:r>
-            <w:proofErr w:type="spellStart"/>
-            <w:r>
-              <w:rPr>
-                <w:rFonts w:ascii="Times New Roman" w:hAnsi="Times New Roman" w:cs="Times New Roman"/>
-                <w:sz w:val="18"/>
-              </w:rPr>
-              <w:t>StaticBody</w:t>
-            </w:r>
-            <w:proofErr w:type="spellEnd"/>
-            <w:r>
-              <w:rPr>
-                <w:rFonts w:ascii="Times New Roman" w:hAnsi="Times New Roman" w:cs="Times New Roman"/>
-                <w:sz w:val="18"/>
-                <w:lang w:val="el-GR"/>
-              </w:rPr>
-              <w:t>3</w:t>
-            </w:r>
-            <w:r>
-              <w:rPr>
-                <w:rFonts w:ascii="Times New Roman" w:hAnsi="Times New Roman" w:cs="Times New Roman"/>
-                <w:sz w:val="18"/>
-              </w:rPr>
-              <w:t>D</w:t>
-            </w:r>
-            <w:r>
-              <w:rPr>
-                <w:rFonts w:ascii="Times New Roman" w:hAnsi="Times New Roman" w:cs="Times New Roman"/>
-                <w:sz w:val="18"/>
-                <w:lang w:val="el-GR"/>
-              </w:rPr>
-              <w:t xml:space="preserve">). Ορίζει τις ιδιότητες </w:t>
-            </w:r>
-            <w:r>
-              <w:rPr>
-                <w:rFonts w:ascii="Times New Roman" w:hAnsi="Times New Roman" w:cs="Times New Roman"/>
-                <w:sz w:val="18"/>
-              </w:rPr>
-              <w:t>prompt</w:t>
-            </w:r>
-            <w:r>
-              <w:rPr>
-                <w:rFonts w:ascii="Times New Roman" w:hAnsi="Times New Roman" w:cs="Times New Roman"/>
-                <w:sz w:val="18"/>
-                <w:lang w:val="el-GR"/>
-              </w:rPr>
-              <w:t>_</w:t>
-            </w:r>
-            <w:r>
-              <w:rPr>
-                <w:rFonts w:ascii="Times New Roman" w:hAnsi="Times New Roman" w:cs="Times New Roman"/>
-                <w:sz w:val="18"/>
-              </w:rPr>
-              <w:t>message</w:t>
-            </w:r>
-            <w:r>
-              <w:rPr>
-                <w:rFonts w:ascii="Times New Roman" w:hAnsi="Times New Roman" w:cs="Times New Roman"/>
-                <w:sz w:val="18"/>
-                <w:lang w:val="el-GR"/>
-              </w:rPr>
-              <w:t xml:space="preserve"> και </w:t>
-            </w:r>
-            <w:r>
-              <w:rPr>
-                <w:rFonts w:ascii="Times New Roman" w:hAnsi="Times New Roman" w:cs="Times New Roman"/>
-                <w:sz w:val="18"/>
-              </w:rPr>
-              <w:t>is</w:t>
-            </w:r>
-            <w:r>
-              <w:rPr>
-                <w:rFonts w:ascii="Times New Roman" w:hAnsi="Times New Roman" w:cs="Times New Roman"/>
-                <w:sz w:val="18"/>
-                <w:lang w:val="el-GR"/>
-              </w:rPr>
-              <w:t>_</w:t>
-            </w:r>
-            <w:r>
-              <w:rPr>
-                <w:rFonts w:ascii="Times New Roman" w:hAnsi="Times New Roman" w:cs="Times New Roman"/>
-                <w:sz w:val="18"/>
-              </w:rPr>
-              <w:t>interactive</w:t>
-            </w:r>
-            <w:r>
-              <w:rPr>
-                <w:rFonts w:ascii="Times New Roman" w:hAnsi="Times New Roman" w:cs="Times New Roman"/>
-                <w:sz w:val="18"/>
-                <w:lang w:val="el-GR"/>
-              </w:rPr>
-              <w:t xml:space="preserve"> για κάθε </w:t>
-            </w:r>
-            <w:proofErr w:type="spellStart"/>
-            <w:r>
-              <w:rPr>
-                <w:rFonts w:ascii="Times New Roman" w:hAnsi="Times New Roman" w:cs="Times New Roman"/>
-                <w:sz w:val="18"/>
-                <w:lang w:val="el-GR"/>
-              </w:rPr>
-              <w:t>αλληλεπιδράσιμο</w:t>
-            </w:r>
-            <w:proofErr w:type="spellEnd"/>
-            <w:r>
-              <w:rPr>
-                <w:rFonts w:ascii="Times New Roman" w:hAnsi="Times New Roman" w:cs="Times New Roman"/>
-                <w:sz w:val="18"/>
-                <w:lang w:val="el-GR"/>
-              </w:rPr>
-              <w:t xml:space="preserve"> αντικείμενο του κόσμου (βιβλία, ράβδοι, οικόσημο). Εκπέμπει το σήμα </w:t>
-            </w:r>
-            <w:r>
-              <w:rPr>
-                <w:rFonts w:ascii="Times New Roman" w:hAnsi="Times New Roman" w:cs="Times New Roman"/>
-                <w:sz w:val="18"/>
-              </w:rPr>
-              <w:t>interacted</w:t>
-            </w:r>
-            <w:r>
-              <w:rPr>
-                <w:rFonts w:ascii="Times New Roman" w:hAnsi="Times New Roman" w:cs="Times New Roman"/>
-                <w:sz w:val="18"/>
-                <w:lang w:val="el-GR"/>
-              </w:rPr>
-              <w:t>(</w:t>
-            </w:r>
-            <w:r>
-              <w:rPr>
-                <w:rFonts w:ascii="Times New Roman" w:hAnsi="Times New Roman" w:cs="Times New Roman"/>
-                <w:sz w:val="18"/>
-              </w:rPr>
-              <w:t>player</w:t>
-            </w:r>
-            <w:r>
-              <w:rPr>
-                <w:rFonts w:ascii="Times New Roman" w:hAnsi="Times New Roman" w:cs="Times New Roman"/>
-                <w:sz w:val="18"/>
-                <w:lang w:val="el-GR"/>
-              </w:rPr>
-              <w:t xml:space="preserve">) όταν ο παίκτης κοιτάζει το αντικείμενο </w:t>
-            </w:r>
-            <w:r>
-              <w:rPr>
-                <w:rFonts w:ascii="Times New Roman" w:hAnsi="Times New Roman" w:cs="Times New Roman"/>
-                <w:sz w:val="18"/>
-                <w:lang w:val="el-GR"/>
-              </w:rPr>
-              <w:lastRenderedPageBreak/>
-              <w:t>και πατάει το πλήκτρο αλληλεπίδρασης.</w:t>
+            <w:r>
+              <w:t>Επαναχρησιμοποιήσιμη κλάση βάσης διαδραστικότητας που κληρονομεί από το CollisionObject3D (StaticBody3D). Ορίζει τις παραμετροποιήσιμες ιδιότητες prompt_message και is_interactive για κάθε αλληλεπιδράσιμο αντικείμενο του περιβάλλοντος (βιβλία, ράβδοι τραπεζιού, μυστικός θυρεός). Υλοποιεί τη συνάρτηση interact(player) και εκπέμπει το σήμα interacted(player) για πλήρη αρχιτεκτονική αποσύνδεση από τη λογική του GameManager.</w:t>
             </w:r>
           </w:p>
         </w:tc>
@@ -2528,1431 +2291,40 @@
         </w:rPr>
       </w:pPr>
       <w:r>
-        <w:rPr>
-          <w:rFonts w:ascii="Times New Roman" w:hAnsi="Times New Roman" w:cs="Times New Roman"/>
-          <w:lang w:val="el-GR"/>
-        </w:rPr>
-        <w:t xml:space="preserve">1. </w:t>
-      </w:r>
-      <w:r>
-        <w:rPr>
-          <w:rFonts w:ascii="Times New Roman" w:hAnsi="Times New Roman" w:cs="Times New Roman"/>
-        </w:rPr>
-        <w:t>player</w:t>
-      </w:r>
-      <w:r>
-        <w:rPr>
-          <w:rFonts w:ascii="Times New Roman" w:hAnsi="Times New Roman" w:cs="Times New Roman"/>
-          <w:lang w:val="el-GR"/>
-        </w:rPr>
-        <w:t>.</w:t>
-      </w:r>
-      <w:proofErr w:type="spellStart"/>
-      <w:r>
-        <w:rPr>
-          <w:rFonts w:ascii="Times New Roman" w:hAnsi="Times New Roman" w:cs="Times New Roman"/>
-        </w:rPr>
-        <w:t>gd</w:t>
-      </w:r>
-      <w:proofErr w:type="spellEnd"/>
-      <w:r>
-        <w:rPr>
-          <w:rFonts w:ascii="Times New Roman" w:hAnsi="Times New Roman" w:cs="Times New Roman"/>
-          <w:lang w:val="el-GR"/>
-        </w:rPr>
-        <w:t xml:space="preserve"> – </w:t>
-      </w:r>
-      <w:r>
-        <w:rPr>
-          <w:rFonts w:ascii="Times New Roman" w:hAnsi="Times New Roman" w:cs="Times New Roman"/>
-        </w:rPr>
-        <w:t>First</w:t>
-      </w:r>
-      <w:r>
-        <w:rPr>
-          <w:rFonts w:ascii="Times New Roman" w:hAnsi="Times New Roman" w:cs="Times New Roman"/>
-          <w:lang w:val="el-GR"/>
-        </w:rPr>
-        <w:t>-</w:t>
-      </w:r>
-      <w:r>
-        <w:rPr>
-          <w:rFonts w:ascii="Times New Roman" w:hAnsi="Times New Roman" w:cs="Times New Roman"/>
-        </w:rPr>
-        <w:t>Person</w:t>
-      </w:r>
-      <w:r>
-        <w:rPr>
-          <w:rFonts w:ascii="Times New Roman" w:hAnsi="Times New Roman" w:cs="Times New Roman"/>
-          <w:lang w:val="el-GR"/>
-        </w:rPr>
-        <w:t xml:space="preserve"> </w:t>
-      </w:r>
-      <w:r>
-        <w:rPr>
-          <w:rFonts w:ascii="Times New Roman" w:hAnsi="Times New Roman" w:cs="Times New Roman"/>
-        </w:rPr>
-        <w:t>Controller</w:t>
-      </w:r>
-      <w:r>
-        <w:rPr>
-          <w:rFonts w:ascii="Times New Roman" w:hAnsi="Times New Roman" w:cs="Times New Roman"/>
-          <w:lang w:val="el-GR"/>
-        </w:rPr>
-        <w:t xml:space="preserve"> &amp; </w:t>
-      </w:r>
-      <w:r>
-        <w:rPr>
-          <w:rFonts w:ascii="Times New Roman" w:hAnsi="Times New Roman" w:cs="Times New Roman"/>
-        </w:rPr>
-        <w:t>Dynamic</w:t>
-      </w:r>
-      <w:r>
-        <w:rPr>
-          <w:rFonts w:ascii="Times New Roman" w:hAnsi="Times New Roman" w:cs="Times New Roman"/>
-          <w:lang w:val="el-GR"/>
-        </w:rPr>
-        <w:t xml:space="preserve"> </w:t>
-      </w:r>
-      <w:r>
-        <w:rPr>
-          <w:rFonts w:ascii="Times New Roman" w:hAnsi="Times New Roman" w:cs="Times New Roman"/>
-        </w:rPr>
-        <w:t>Feedback</w:t>
-      </w:r>
-      <w:r>
-        <w:rPr>
-          <w:rFonts w:ascii="Times New Roman" w:hAnsi="Times New Roman" w:cs="Times New Roman"/>
-          <w:lang w:val="el-GR"/>
-        </w:rPr>
-        <w:t>:</w:t>
-      </w:r>
-      <w:r>
-        <w:rPr>
-          <w:rFonts w:ascii="Times New Roman" w:hAnsi="Times New Roman" w:cs="Times New Roman"/>
-          <w:lang w:val="el-GR"/>
-        </w:rPr>
-        <w:br/>
-        <w:t>• _</w:t>
-      </w:r>
-      <w:r>
-        <w:rPr>
-          <w:rFonts w:ascii="Times New Roman" w:hAnsi="Times New Roman" w:cs="Times New Roman"/>
-        </w:rPr>
-        <w:t>input</w:t>
-      </w:r>
-      <w:r>
-        <w:rPr>
-          <w:rFonts w:ascii="Times New Roman" w:hAnsi="Times New Roman" w:cs="Times New Roman"/>
-          <w:lang w:val="el-GR"/>
-        </w:rPr>
-        <w:t>(</w:t>
-      </w:r>
-      <w:r>
-        <w:rPr>
-          <w:rFonts w:ascii="Times New Roman" w:hAnsi="Times New Roman" w:cs="Times New Roman"/>
-        </w:rPr>
-        <w:t>event</w:t>
-      </w:r>
-      <w:r>
-        <w:rPr>
-          <w:rFonts w:ascii="Times New Roman" w:hAnsi="Times New Roman" w:cs="Times New Roman"/>
-          <w:lang w:val="el-GR"/>
-        </w:rPr>
-        <w:t xml:space="preserve">): Επεξεργάζεται την κίνηση του ποντικιού με </w:t>
-      </w:r>
-      <w:r>
-        <w:rPr>
-          <w:rFonts w:ascii="Times New Roman" w:hAnsi="Times New Roman" w:cs="Times New Roman"/>
-        </w:rPr>
-        <w:t>pitch</w:t>
-      </w:r>
-      <w:r>
-        <w:rPr>
-          <w:rFonts w:ascii="Times New Roman" w:hAnsi="Times New Roman" w:cs="Times New Roman"/>
-          <w:lang w:val="el-GR"/>
-        </w:rPr>
-        <w:t xml:space="preserve"> </w:t>
-      </w:r>
-      <w:r>
-        <w:rPr>
-          <w:rFonts w:ascii="Times New Roman" w:hAnsi="Times New Roman" w:cs="Times New Roman"/>
-        </w:rPr>
-        <w:t>accumulator</w:t>
-      </w:r>
-      <w:r>
-        <w:rPr>
-          <w:rFonts w:ascii="Times New Roman" w:hAnsi="Times New Roman" w:cs="Times New Roman"/>
-          <w:lang w:val="el-GR"/>
-        </w:rPr>
-        <w:t xml:space="preserve"> (</w:t>
-      </w:r>
-      <w:r>
-        <w:rPr>
-          <w:rFonts w:ascii="Times New Roman" w:hAnsi="Times New Roman" w:cs="Times New Roman"/>
-        </w:rPr>
-        <w:t>clamp</w:t>
-      </w:r>
-      <w:r>
-        <w:rPr>
-          <w:rFonts w:ascii="Times New Roman" w:hAnsi="Times New Roman" w:cs="Times New Roman"/>
-          <w:lang w:val="el-GR"/>
-        </w:rPr>
-        <w:t xml:space="preserve"> -80° έως +80°) εξαλείφοντας πλήρως σφάλματα </w:t>
-      </w:r>
-      <w:r>
-        <w:rPr>
-          <w:rFonts w:ascii="Times New Roman" w:hAnsi="Times New Roman" w:cs="Times New Roman"/>
-        </w:rPr>
-        <w:t>gimbal</w:t>
-      </w:r>
-      <w:r>
-        <w:rPr>
-          <w:rFonts w:ascii="Times New Roman" w:hAnsi="Times New Roman" w:cs="Times New Roman"/>
-          <w:lang w:val="el-GR"/>
-        </w:rPr>
-        <w:t xml:space="preserve"> </w:t>
-      </w:r>
-      <w:r>
-        <w:rPr>
-          <w:rFonts w:ascii="Times New Roman" w:hAnsi="Times New Roman" w:cs="Times New Roman"/>
-        </w:rPr>
-        <w:t>lock</w:t>
-      </w:r>
-      <w:r>
-        <w:rPr>
-          <w:rFonts w:ascii="Times New Roman" w:hAnsi="Times New Roman" w:cs="Times New Roman"/>
-          <w:lang w:val="el-GR"/>
-        </w:rPr>
-        <w:t xml:space="preserve"> ή </w:t>
-      </w:r>
-      <w:proofErr w:type="spellStart"/>
-      <w:r>
-        <w:rPr>
-          <w:rFonts w:ascii="Times New Roman" w:hAnsi="Times New Roman" w:cs="Times New Roman"/>
-        </w:rPr>
-        <w:t>NaN</w:t>
-      </w:r>
-      <w:proofErr w:type="spellEnd"/>
-      <w:r>
-        <w:rPr>
-          <w:rFonts w:ascii="Times New Roman" w:hAnsi="Times New Roman" w:cs="Times New Roman"/>
-          <w:lang w:val="el-GR"/>
-        </w:rPr>
-        <w:t xml:space="preserve"> κατά τη συνεχή περιστροφή.</w:t>
-      </w:r>
-      <w:r>
-        <w:rPr>
-          <w:rFonts w:ascii="Times New Roman" w:hAnsi="Times New Roman" w:cs="Times New Roman"/>
-          <w:lang w:val="el-GR"/>
-        </w:rPr>
-        <w:br/>
-        <w:t>• _</w:t>
-      </w:r>
-      <w:r>
-        <w:rPr>
-          <w:rFonts w:ascii="Times New Roman" w:hAnsi="Times New Roman" w:cs="Times New Roman"/>
-        </w:rPr>
-        <w:t>unhandled</w:t>
-      </w:r>
-      <w:r>
-        <w:rPr>
-          <w:rFonts w:ascii="Times New Roman" w:hAnsi="Times New Roman" w:cs="Times New Roman"/>
-          <w:lang w:val="el-GR"/>
-        </w:rPr>
-        <w:t>_</w:t>
-      </w:r>
-      <w:r>
-        <w:rPr>
-          <w:rFonts w:ascii="Times New Roman" w:hAnsi="Times New Roman" w:cs="Times New Roman"/>
-        </w:rPr>
-        <w:t>input</w:t>
-      </w:r>
-      <w:r>
-        <w:rPr>
-          <w:rFonts w:ascii="Times New Roman" w:hAnsi="Times New Roman" w:cs="Times New Roman"/>
-          <w:lang w:val="el-GR"/>
-        </w:rPr>
-        <w:t>(</w:t>
-      </w:r>
-      <w:r>
-        <w:rPr>
-          <w:rFonts w:ascii="Times New Roman" w:hAnsi="Times New Roman" w:cs="Times New Roman"/>
-        </w:rPr>
-        <w:t>event</w:t>
-      </w:r>
-      <w:r>
-        <w:rPr>
-          <w:rFonts w:ascii="Times New Roman" w:hAnsi="Times New Roman" w:cs="Times New Roman"/>
-          <w:lang w:val="el-GR"/>
-        </w:rPr>
-        <w:t>): Ελέγχει το φυσικό πλήκτρο (</w:t>
-      </w:r>
-      <w:proofErr w:type="gramStart"/>
-      <w:r>
-        <w:rPr>
-          <w:rFonts w:ascii="Times New Roman" w:hAnsi="Times New Roman" w:cs="Times New Roman"/>
-        </w:rPr>
-        <w:t>event</w:t>
-      </w:r>
-      <w:r>
-        <w:rPr>
-          <w:rFonts w:ascii="Times New Roman" w:hAnsi="Times New Roman" w:cs="Times New Roman"/>
-          <w:lang w:val="el-GR"/>
-        </w:rPr>
-        <w:t>.</w:t>
-      </w:r>
-      <w:r>
-        <w:rPr>
-          <w:rFonts w:ascii="Times New Roman" w:hAnsi="Times New Roman" w:cs="Times New Roman"/>
-        </w:rPr>
-        <w:t>physical</w:t>
-      </w:r>
-      <w:proofErr w:type="gramEnd"/>
-      <w:r>
-        <w:rPr>
-          <w:rFonts w:ascii="Times New Roman" w:hAnsi="Times New Roman" w:cs="Times New Roman"/>
-          <w:lang w:val="el-GR"/>
-        </w:rPr>
-        <w:t>_</w:t>
-      </w:r>
-      <w:r>
-        <w:rPr>
-          <w:rFonts w:ascii="Times New Roman" w:hAnsi="Times New Roman" w:cs="Times New Roman"/>
-        </w:rPr>
-        <w:t>keycode</w:t>
-      </w:r>
-      <w:r>
-        <w:rPr>
-          <w:rFonts w:ascii="Times New Roman" w:hAnsi="Times New Roman" w:cs="Times New Roman"/>
-          <w:lang w:val="el-GR"/>
-        </w:rPr>
-        <w:t xml:space="preserve"> == </w:t>
-      </w:r>
-      <w:r>
-        <w:rPr>
-          <w:rFonts w:ascii="Times New Roman" w:hAnsi="Times New Roman" w:cs="Times New Roman"/>
-        </w:rPr>
-        <w:t>KEY</w:t>
-      </w:r>
-      <w:r>
-        <w:rPr>
-          <w:rFonts w:ascii="Times New Roman" w:hAnsi="Times New Roman" w:cs="Times New Roman"/>
-          <w:lang w:val="el-GR"/>
-        </w:rPr>
-        <w:t>_</w:t>
-      </w:r>
-      <w:r>
-        <w:rPr>
-          <w:rFonts w:ascii="Times New Roman" w:hAnsi="Times New Roman" w:cs="Times New Roman"/>
-        </w:rPr>
-        <w:t>E</w:t>
-      </w:r>
-      <w:r>
-        <w:rPr>
-          <w:rFonts w:ascii="Times New Roman" w:hAnsi="Times New Roman" w:cs="Times New Roman"/>
-          <w:lang w:val="el-GR"/>
-        </w:rPr>
-        <w:t xml:space="preserve">) ή το αριστερό κλικ ποντικιού. Ενεργοποιεί </w:t>
-      </w:r>
-      <w:r>
-        <w:rPr>
-          <w:rFonts w:ascii="Times New Roman" w:hAnsi="Times New Roman" w:cs="Times New Roman"/>
-        </w:rPr>
-        <w:t>Tween</w:t>
-      </w:r>
-      <w:r>
-        <w:rPr>
-          <w:rFonts w:ascii="Times New Roman" w:hAnsi="Times New Roman" w:cs="Times New Roman"/>
-          <w:lang w:val="el-GR"/>
-        </w:rPr>
-        <w:t xml:space="preserve"> στο </w:t>
-      </w:r>
-      <w:proofErr w:type="spellStart"/>
-      <w:r>
-        <w:rPr>
-          <w:rFonts w:ascii="Times New Roman" w:hAnsi="Times New Roman" w:cs="Times New Roman"/>
-        </w:rPr>
-        <w:t>HandPivot</w:t>
-      </w:r>
-      <w:proofErr w:type="spellEnd"/>
-      <w:r>
-        <w:rPr>
-          <w:rFonts w:ascii="Times New Roman" w:hAnsi="Times New Roman" w:cs="Times New Roman"/>
-          <w:lang w:val="el-GR"/>
-        </w:rPr>
-        <w:t xml:space="preserve"> για κίνηση απλώματος (</w:t>
-      </w:r>
-      <w:r>
-        <w:rPr>
-          <w:rFonts w:ascii="Times New Roman" w:hAnsi="Times New Roman" w:cs="Times New Roman"/>
-        </w:rPr>
-        <w:t>forward</w:t>
-      </w:r>
-      <w:r>
-        <w:rPr>
-          <w:rFonts w:ascii="Times New Roman" w:hAnsi="Times New Roman" w:cs="Times New Roman"/>
-          <w:lang w:val="el-GR"/>
-        </w:rPr>
-        <w:t xml:space="preserve"> </w:t>
-      </w:r>
-      <w:r>
-        <w:rPr>
-          <w:rFonts w:ascii="Times New Roman" w:hAnsi="Times New Roman" w:cs="Times New Roman"/>
-        </w:rPr>
-        <w:t>translation</w:t>
-      </w:r>
-      <w:r>
-        <w:rPr>
-          <w:rFonts w:ascii="Times New Roman" w:hAnsi="Times New Roman" w:cs="Times New Roman"/>
-          <w:lang w:val="el-GR"/>
-        </w:rPr>
-        <w:t xml:space="preserve"> σε 0.1</w:t>
-      </w:r>
-      <w:r>
-        <w:rPr>
-          <w:rFonts w:ascii="Times New Roman" w:hAnsi="Times New Roman" w:cs="Times New Roman"/>
-        </w:rPr>
-        <w:t>s</w:t>
-      </w:r>
-      <w:r>
-        <w:rPr>
-          <w:rFonts w:ascii="Times New Roman" w:hAnsi="Times New Roman" w:cs="Times New Roman"/>
-          <w:lang w:val="el-GR"/>
-        </w:rPr>
-        <w:t xml:space="preserve"> και </w:t>
-      </w:r>
-      <w:r>
-        <w:rPr>
-          <w:rFonts w:ascii="Times New Roman" w:hAnsi="Times New Roman" w:cs="Times New Roman"/>
-        </w:rPr>
-        <w:t>return</w:t>
-      </w:r>
-      <w:r>
-        <w:rPr>
-          <w:rFonts w:ascii="Times New Roman" w:hAnsi="Times New Roman" w:cs="Times New Roman"/>
-          <w:lang w:val="el-GR"/>
-        </w:rPr>
-        <w:t xml:space="preserve"> σε 0.15</w:t>
-      </w:r>
-      <w:r>
-        <w:rPr>
-          <w:rFonts w:ascii="Times New Roman" w:hAnsi="Times New Roman" w:cs="Times New Roman"/>
-        </w:rPr>
-        <w:t>s</w:t>
-      </w:r>
-      <w:r>
-        <w:rPr>
-          <w:rFonts w:ascii="Times New Roman" w:hAnsi="Times New Roman" w:cs="Times New Roman"/>
-          <w:lang w:val="el-GR"/>
-        </w:rPr>
-        <w:t>) με ασφαλή ανακύκλωση (</w:t>
-      </w:r>
-      <w:r>
-        <w:rPr>
-          <w:rFonts w:ascii="Times New Roman" w:hAnsi="Times New Roman" w:cs="Times New Roman"/>
-        </w:rPr>
-        <w:t>tween</w:t>
-      </w:r>
-      <w:r>
-        <w:rPr>
-          <w:rFonts w:ascii="Times New Roman" w:hAnsi="Times New Roman" w:cs="Times New Roman"/>
-          <w:lang w:val="el-GR"/>
-        </w:rPr>
-        <w:t>.</w:t>
-      </w:r>
-      <w:r>
-        <w:rPr>
-          <w:rFonts w:ascii="Times New Roman" w:hAnsi="Times New Roman" w:cs="Times New Roman"/>
-        </w:rPr>
-        <w:t>kill</w:t>
-      </w:r>
-      <w:r>
-        <w:rPr>
-          <w:rFonts w:ascii="Times New Roman" w:hAnsi="Times New Roman" w:cs="Times New Roman"/>
-          <w:lang w:val="el-GR"/>
-        </w:rPr>
-        <w:t>()).</w:t>
-      </w:r>
-      <w:r>
-        <w:rPr>
-          <w:rFonts w:ascii="Times New Roman" w:hAnsi="Times New Roman" w:cs="Times New Roman"/>
-          <w:lang w:val="el-GR"/>
-        </w:rPr>
-        <w:br/>
-      </w:r>
-      <w:r>
-        <w:rPr>
-          <w:rFonts w:ascii="Times New Roman" w:hAnsi="Times New Roman" w:cs="Times New Roman"/>
-        </w:rPr>
-        <w:t>• _</w:t>
-      </w:r>
-      <w:proofErr w:type="spellStart"/>
-      <w:r>
-        <w:rPr>
-          <w:rFonts w:ascii="Times New Roman" w:hAnsi="Times New Roman" w:cs="Times New Roman"/>
-        </w:rPr>
-        <w:t>physics_process</w:t>
-      </w:r>
-      <w:proofErr w:type="spellEnd"/>
-      <w:r>
-        <w:rPr>
-          <w:rFonts w:ascii="Times New Roman" w:hAnsi="Times New Roman" w:cs="Times New Roman"/>
-        </w:rPr>
-        <w:t>(delta): Υπ</w:t>
-      </w:r>
-      <w:proofErr w:type="spellStart"/>
-      <w:r>
-        <w:rPr>
-          <w:rFonts w:ascii="Times New Roman" w:hAnsi="Times New Roman" w:cs="Times New Roman"/>
-        </w:rPr>
-        <w:t>ολογίζει</w:t>
-      </w:r>
-      <w:proofErr w:type="spellEnd"/>
-      <w:r>
-        <w:rPr>
-          <w:rFonts w:ascii="Times New Roman" w:hAnsi="Times New Roman" w:cs="Times New Roman"/>
-        </w:rPr>
-        <w:t xml:space="preserve"> </w:t>
-      </w:r>
-      <w:proofErr w:type="spellStart"/>
-      <w:r>
-        <w:rPr>
-          <w:rFonts w:ascii="Times New Roman" w:hAnsi="Times New Roman" w:cs="Times New Roman"/>
-        </w:rPr>
-        <w:t>την</w:t>
-      </w:r>
-      <w:proofErr w:type="spellEnd"/>
-      <w:r>
-        <w:rPr>
-          <w:rFonts w:ascii="Times New Roman" w:hAnsi="Times New Roman" w:cs="Times New Roman"/>
-        </w:rPr>
-        <w:t xml:space="preserve"> </w:t>
-      </w:r>
-      <w:proofErr w:type="spellStart"/>
-      <w:r>
-        <w:rPr>
-          <w:rFonts w:ascii="Times New Roman" w:hAnsi="Times New Roman" w:cs="Times New Roman"/>
-        </w:rPr>
-        <w:t>κίνηση</w:t>
-      </w:r>
-      <w:proofErr w:type="spellEnd"/>
-      <w:r>
-        <w:rPr>
-          <w:rFonts w:ascii="Times New Roman" w:hAnsi="Times New Roman" w:cs="Times New Roman"/>
-        </w:rPr>
-        <w:t xml:space="preserve"> </w:t>
-      </w:r>
-      <w:proofErr w:type="spellStart"/>
-      <w:r>
-        <w:rPr>
-          <w:rFonts w:ascii="Times New Roman" w:hAnsi="Times New Roman" w:cs="Times New Roman"/>
-        </w:rPr>
-        <w:t>μέσω</w:t>
-      </w:r>
-      <w:proofErr w:type="spellEnd"/>
-      <w:r>
-        <w:rPr>
-          <w:rFonts w:ascii="Times New Roman" w:hAnsi="Times New Roman" w:cs="Times New Roman"/>
-        </w:rPr>
-        <w:t xml:space="preserve"> </w:t>
-      </w:r>
-      <w:proofErr w:type="spellStart"/>
-      <w:proofErr w:type="gramStart"/>
-      <w:r>
-        <w:rPr>
-          <w:rFonts w:ascii="Times New Roman" w:hAnsi="Times New Roman" w:cs="Times New Roman"/>
-        </w:rPr>
-        <w:t>transform.basis</w:t>
-      </w:r>
-      <w:proofErr w:type="spellEnd"/>
-      <w:proofErr w:type="gramEnd"/>
-      <w:r>
-        <w:rPr>
-          <w:rFonts w:ascii="Times New Roman" w:hAnsi="Times New Roman" w:cs="Times New Roman"/>
-        </w:rPr>
-        <w:t xml:space="preserve"> και </w:t>
-      </w:r>
-      <w:proofErr w:type="spellStart"/>
-      <w:r>
-        <w:rPr>
-          <w:rFonts w:ascii="Times New Roman" w:hAnsi="Times New Roman" w:cs="Times New Roman"/>
-        </w:rPr>
-        <w:t>move_and_slide</w:t>
-      </w:r>
-      <w:proofErr w:type="spellEnd"/>
-      <w:r>
-        <w:rPr>
-          <w:rFonts w:ascii="Times New Roman" w:hAnsi="Times New Roman" w:cs="Times New Roman"/>
-        </w:rPr>
-        <w:t xml:space="preserve">(). </w:t>
-      </w:r>
-      <w:r>
-        <w:rPr>
-          <w:rFonts w:ascii="Times New Roman" w:hAnsi="Times New Roman" w:cs="Times New Roman"/>
-          <w:lang w:val="el-GR"/>
-        </w:rPr>
-        <w:t xml:space="preserve">Ελέγχει την ακτίνα </w:t>
-      </w:r>
-      <w:proofErr w:type="spellStart"/>
-      <w:r>
-        <w:rPr>
-          <w:rFonts w:ascii="Times New Roman" w:hAnsi="Times New Roman" w:cs="Times New Roman"/>
-        </w:rPr>
-        <w:t>raycast</w:t>
-      </w:r>
-      <w:proofErr w:type="spellEnd"/>
-      <w:r>
-        <w:rPr>
-          <w:rFonts w:ascii="Times New Roman" w:hAnsi="Times New Roman" w:cs="Times New Roman"/>
-          <w:lang w:val="el-GR"/>
-        </w:rPr>
-        <w:t>.</w:t>
-      </w:r>
-      <w:r>
-        <w:rPr>
-          <w:rFonts w:ascii="Times New Roman" w:hAnsi="Times New Roman" w:cs="Times New Roman"/>
-        </w:rPr>
-        <w:t>is</w:t>
-      </w:r>
-      <w:r>
-        <w:rPr>
-          <w:rFonts w:ascii="Times New Roman" w:hAnsi="Times New Roman" w:cs="Times New Roman"/>
-          <w:lang w:val="el-GR"/>
-        </w:rPr>
-        <w:t>_</w:t>
-      </w:r>
-      <w:r>
-        <w:rPr>
-          <w:rFonts w:ascii="Times New Roman" w:hAnsi="Times New Roman" w:cs="Times New Roman"/>
-        </w:rPr>
-        <w:t>colliding</w:t>
-      </w:r>
-      <w:r>
-        <w:rPr>
-          <w:rFonts w:ascii="Times New Roman" w:hAnsi="Times New Roman" w:cs="Times New Roman"/>
-          <w:lang w:val="el-GR"/>
-        </w:rPr>
-        <w:t>() (εμβέλεια 3.0</w:t>
-      </w:r>
-      <w:r>
-        <w:rPr>
-          <w:rFonts w:ascii="Times New Roman" w:hAnsi="Times New Roman" w:cs="Times New Roman"/>
-        </w:rPr>
-        <w:t>m</w:t>
-      </w:r>
-      <w:r>
-        <w:rPr>
-          <w:rFonts w:ascii="Times New Roman" w:hAnsi="Times New Roman" w:cs="Times New Roman"/>
-          <w:lang w:val="el-GR"/>
-        </w:rPr>
-        <w:t xml:space="preserve">) και ενημερώνει το </w:t>
-      </w:r>
-      <w:proofErr w:type="spellStart"/>
-      <w:r>
-        <w:rPr>
-          <w:rFonts w:ascii="Times New Roman" w:hAnsi="Times New Roman" w:cs="Times New Roman"/>
-        </w:rPr>
-        <w:t>InteractionPrompt</w:t>
-      </w:r>
-      <w:proofErr w:type="spellEnd"/>
-      <w:r>
-        <w:rPr>
-          <w:rFonts w:ascii="Times New Roman" w:hAnsi="Times New Roman" w:cs="Times New Roman"/>
-          <w:lang w:val="el-GR"/>
-        </w:rPr>
-        <w:t xml:space="preserve"> καθώς και το </w:t>
-      </w:r>
-      <w:r>
-        <w:rPr>
-          <w:rFonts w:ascii="Times New Roman" w:hAnsi="Times New Roman" w:cs="Times New Roman"/>
-        </w:rPr>
-        <w:t>Crosshair</w:t>
-      </w:r>
-      <w:r>
-        <w:rPr>
-          <w:rFonts w:ascii="Times New Roman" w:hAnsi="Times New Roman" w:cs="Times New Roman"/>
-          <w:lang w:val="el-GR"/>
-        </w:rPr>
-        <w:t xml:space="preserve"> σε χρυσό εικονίδιο </w:t>
-      </w:r>
-      <w:r>
-        <w:rPr>
-          <w:rFonts w:ascii="Apple Color Emoji" w:hAnsi="Apple Color Emoji" w:cs="Apple Color Emoji"/>
-          <w:lang w:val="el-GR"/>
-        </w:rPr>
-        <w:t>✋</w:t>
-      </w:r>
-      <w:r>
-        <w:rPr>
-          <w:rFonts w:ascii="Times New Roman" w:hAnsi="Times New Roman" w:cs="Times New Roman"/>
-          <w:lang w:val="el-GR"/>
-        </w:rPr>
-        <w:t>.</w:t>
-      </w:r>
-      <w:r>
-        <w:rPr>
-          <w:rFonts w:ascii="Times New Roman" w:hAnsi="Times New Roman" w:cs="Times New Roman"/>
-          <w:lang w:val="el-GR"/>
-        </w:rPr>
-        <w:br/>
-        <w:t xml:space="preserve">• </w:t>
-      </w:r>
-      <w:r>
-        <w:rPr>
-          <w:rFonts w:ascii="Times New Roman" w:hAnsi="Times New Roman" w:cs="Times New Roman"/>
-        </w:rPr>
-        <w:t>escape</w:t>
-      </w:r>
-      <w:r>
-        <w:rPr>
-          <w:rFonts w:ascii="Times New Roman" w:hAnsi="Times New Roman" w:cs="Times New Roman"/>
-          <w:lang w:val="el-GR"/>
-        </w:rPr>
-        <w:t>(</w:t>
-      </w:r>
-      <w:r>
-        <w:rPr>
-          <w:rFonts w:ascii="Times New Roman" w:hAnsi="Times New Roman" w:cs="Times New Roman"/>
-        </w:rPr>
-        <w:t>body</w:t>
-      </w:r>
-      <w:r>
-        <w:rPr>
-          <w:rFonts w:ascii="Times New Roman" w:hAnsi="Times New Roman" w:cs="Times New Roman"/>
-          <w:lang w:val="el-GR"/>
-        </w:rPr>
-        <w:t>): Καλείται κατά την είσοδο στην περιοχή εξόδου με προστασία διπλής κλήσης (</w:t>
-      </w:r>
-      <w:r>
-        <w:rPr>
-          <w:rFonts w:ascii="Times New Roman" w:hAnsi="Times New Roman" w:cs="Times New Roman"/>
-        </w:rPr>
-        <w:t>has</w:t>
-      </w:r>
-      <w:r>
-        <w:rPr>
-          <w:rFonts w:ascii="Times New Roman" w:hAnsi="Times New Roman" w:cs="Times New Roman"/>
-          <w:lang w:val="el-GR"/>
-        </w:rPr>
-        <w:t>_</w:t>
-      </w:r>
-      <w:r>
-        <w:rPr>
-          <w:rFonts w:ascii="Times New Roman" w:hAnsi="Times New Roman" w:cs="Times New Roman"/>
-        </w:rPr>
-        <w:t>escaped</w:t>
-      </w:r>
-      <w:r>
-        <w:rPr>
-          <w:rFonts w:ascii="Times New Roman" w:hAnsi="Times New Roman" w:cs="Times New Roman"/>
-          <w:lang w:val="el-GR"/>
-        </w:rPr>
-        <w:t xml:space="preserve"> </w:t>
-      </w:r>
-      <w:r>
-        <w:rPr>
-          <w:rFonts w:ascii="Times New Roman" w:hAnsi="Times New Roman" w:cs="Times New Roman"/>
-        </w:rPr>
-        <w:t>flag</w:t>
-      </w:r>
-      <w:r>
-        <w:rPr>
-          <w:rFonts w:ascii="Times New Roman" w:hAnsi="Times New Roman" w:cs="Times New Roman"/>
-          <w:lang w:val="el-GR"/>
-        </w:rPr>
-        <w:t xml:space="preserve">), εμφανίζει την οθόνη νίκης για 3 δευτερόλεπτα και τερματίζει την εφαρμογή με </w:t>
-      </w:r>
-      <w:r>
-        <w:rPr>
-          <w:rFonts w:ascii="Times New Roman" w:hAnsi="Times New Roman" w:cs="Times New Roman"/>
-        </w:rPr>
-        <w:t>get</w:t>
-      </w:r>
-      <w:r>
-        <w:rPr>
-          <w:rFonts w:ascii="Times New Roman" w:hAnsi="Times New Roman" w:cs="Times New Roman"/>
-          <w:lang w:val="el-GR"/>
-        </w:rPr>
-        <w:t>_</w:t>
-      </w:r>
-      <w:r>
-        <w:rPr>
-          <w:rFonts w:ascii="Times New Roman" w:hAnsi="Times New Roman" w:cs="Times New Roman"/>
-        </w:rPr>
-        <w:t>tree</w:t>
-      </w:r>
-      <w:r>
-        <w:rPr>
-          <w:rFonts w:ascii="Times New Roman" w:hAnsi="Times New Roman" w:cs="Times New Roman"/>
-          <w:lang w:val="el-GR"/>
-        </w:rPr>
-        <w:t>().</w:t>
-      </w:r>
-      <w:r>
-        <w:rPr>
-          <w:rFonts w:ascii="Times New Roman" w:hAnsi="Times New Roman" w:cs="Times New Roman"/>
-        </w:rPr>
-        <w:t>quit</w:t>
-      </w:r>
-      <w:r>
-        <w:rPr>
-          <w:rFonts w:ascii="Times New Roman" w:hAnsi="Times New Roman" w:cs="Times New Roman"/>
-          <w:lang w:val="el-GR"/>
-        </w:rPr>
-        <w:t>().</w:t>
-      </w:r>
-      <w:r>
-        <w:rPr>
-          <w:rFonts w:ascii="Times New Roman" w:hAnsi="Times New Roman" w:cs="Times New Roman"/>
-          <w:lang w:val="el-GR"/>
-        </w:rPr>
-        <w:br/>
-      </w:r>
-      <w:r>
-        <w:rPr>
-          <w:rFonts w:ascii="Times New Roman" w:hAnsi="Times New Roman" w:cs="Times New Roman"/>
-          <w:lang w:val="el-GR"/>
-        </w:rPr>
-        <w:br/>
-        <w:t xml:space="preserve">2. </w:t>
-      </w:r>
-      <w:r>
-        <w:rPr>
-          <w:rFonts w:ascii="Times New Roman" w:hAnsi="Times New Roman" w:cs="Times New Roman"/>
-        </w:rPr>
-        <w:t>game</w:t>
-      </w:r>
-      <w:r>
-        <w:rPr>
-          <w:rFonts w:ascii="Times New Roman" w:hAnsi="Times New Roman" w:cs="Times New Roman"/>
-          <w:lang w:val="el-GR"/>
-        </w:rPr>
-        <w:t>_</w:t>
-      </w:r>
-      <w:r>
-        <w:rPr>
-          <w:rFonts w:ascii="Times New Roman" w:hAnsi="Times New Roman" w:cs="Times New Roman"/>
-        </w:rPr>
-        <w:t>manager</w:t>
-      </w:r>
-      <w:r>
-        <w:rPr>
-          <w:rFonts w:ascii="Times New Roman" w:hAnsi="Times New Roman" w:cs="Times New Roman"/>
-          <w:lang w:val="el-GR"/>
-        </w:rPr>
-        <w:t>.</w:t>
-      </w:r>
-      <w:proofErr w:type="spellStart"/>
-      <w:r>
-        <w:rPr>
-          <w:rFonts w:ascii="Times New Roman" w:hAnsi="Times New Roman" w:cs="Times New Roman"/>
-        </w:rPr>
-        <w:t>gd</w:t>
-      </w:r>
-      <w:proofErr w:type="spellEnd"/>
-      <w:r>
-        <w:rPr>
-          <w:rFonts w:ascii="Times New Roman" w:hAnsi="Times New Roman" w:cs="Times New Roman"/>
-          <w:lang w:val="el-GR"/>
-        </w:rPr>
-        <w:t xml:space="preserve"> – </w:t>
-      </w:r>
-      <w:r>
-        <w:rPr>
-          <w:rFonts w:ascii="Times New Roman" w:hAnsi="Times New Roman" w:cs="Times New Roman"/>
-        </w:rPr>
-        <w:t>Puzzle</w:t>
-      </w:r>
-      <w:r>
-        <w:rPr>
-          <w:rFonts w:ascii="Times New Roman" w:hAnsi="Times New Roman" w:cs="Times New Roman"/>
-          <w:lang w:val="el-GR"/>
-        </w:rPr>
-        <w:t xml:space="preserve"> </w:t>
-      </w:r>
-      <w:r>
-        <w:rPr>
-          <w:rFonts w:ascii="Times New Roman" w:hAnsi="Times New Roman" w:cs="Times New Roman"/>
-        </w:rPr>
-        <w:t>Logic</w:t>
-      </w:r>
-      <w:r>
-        <w:rPr>
-          <w:rFonts w:ascii="Times New Roman" w:hAnsi="Times New Roman" w:cs="Times New Roman"/>
-          <w:lang w:val="el-GR"/>
-        </w:rPr>
-        <w:t xml:space="preserve"> &amp; </w:t>
-      </w:r>
-      <w:r>
-        <w:rPr>
-          <w:rFonts w:ascii="Times New Roman" w:hAnsi="Times New Roman" w:cs="Times New Roman"/>
-        </w:rPr>
-        <w:t>Permutation</w:t>
-      </w:r>
-      <w:r>
-        <w:rPr>
-          <w:rFonts w:ascii="Times New Roman" w:hAnsi="Times New Roman" w:cs="Times New Roman"/>
-          <w:lang w:val="el-GR"/>
-        </w:rPr>
-        <w:t xml:space="preserve"> </w:t>
-      </w:r>
-      <w:r>
-        <w:rPr>
-          <w:rFonts w:ascii="Times New Roman" w:hAnsi="Times New Roman" w:cs="Times New Roman"/>
-        </w:rPr>
-        <w:t>Math</w:t>
-      </w:r>
-      <w:r>
-        <w:rPr>
-          <w:rFonts w:ascii="Times New Roman" w:hAnsi="Times New Roman" w:cs="Times New Roman"/>
-          <w:lang w:val="el-GR"/>
-        </w:rPr>
-        <w:t>:</w:t>
-      </w:r>
-      <w:r>
-        <w:rPr>
-          <w:rFonts w:ascii="Times New Roman" w:hAnsi="Times New Roman" w:cs="Times New Roman"/>
-          <w:lang w:val="el-GR"/>
-        </w:rPr>
-        <w:br/>
-        <w:t>• _</w:t>
-      </w:r>
-      <w:r>
-        <w:rPr>
-          <w:rFonts w:ascii="Times New Roman" w:hAnsi="Times New Roman" w:cs="Times New Roman"/>
-        </w:rPr>
-        <w:t>on</w:t>
-      </w:r>
-      <w:r>
-        <w:rPr>
-          <w:rFonts w:ascii="Times New Roman" w:hAnsi="Times New Roman" w:cs="Times New Roman"/>
-          <w:lang w:val="el-GR"/>
-        </w:rPr>
-        <w:t>_</w:t>
-      </w:r>
-      <w:r>
-        <w:rPr>
-          <w:rFonts w:ascii="Times New Roman" w:hAnsi="Times New Roman" w:cs="Times New Roman"/>
-        </w:rPr>
-        <w:t>switch</w:t>
-      </w:r>
-      <w:r>
-        <w:rPr>
-          <w:rFonts w:ascii="Times New Roman" w:hAnsi="Times New Roman" w:cs="Times New Roman"/>
-          <w:lang w:val="el-GR"/>
-        </w:rPr>
-        <w:t>_</w:t>
-      </w:r>
-      <w:proofErr w:type="gramStart"/>
-      <w:r>
-        <w:rPr>
-          <w:rFonts w:ascii="Times New Roman" w:hAnsi="Times New Roman" w:cs="Times New Roman"/>
-        </w:rPr>
-        <w:t>interacted</w:t>
-      </w:r>
-      <w:r>
-        <w:rPr>
-          <w:rFonts w:ascii="Times New Roman" w:hAnsi="Times New Roman" w:cs="Times New Roman"/>
-          <w:lang w:val="el-GR"/>
-        </w:rPr>
-        <w:t>(</w:t>
-      </w:r>
-      <w:proofErr w:type="gramEnd"/>
-      <w:r>
-        <w:rPr>
-          <w:rFonts w:ascii="Times New Roman" w:hAnsi="Times New Roman" w:cs="Times New Roman"/>
-        </w:rPr>
-        <w:t>player</w:t>
-      </w:r>
-      <w:r>
-        <w:rPr>
-          <w:rFonts w:ascii="Times New Roman" w:hAnsi="Times New Roman" w:cs="Times New Roman"/>
-          <w:lang w:val="el-GR"/>
-        </w:rPr>
-        <w:t xml:space="preserve">, </w:t>
-      </w:r>
-      <w:r>
-        <w:rPr>
-          <w:rFonts w:ascii="Times New Roman" w:hAnsi="Times New Roman" w:cs="Times New Roman"/>
-        </w:rPr>
-        <w:t>index</w:t>
-      </w:r>
-      <w:r>
-        <w:rPr>
-          <w:rFonts w:ascii="Times New Roman" w:hAnsi="Times New Roman" w:cs="Times New Roman"/>
-          <w:lang w:val="el-GR"/>
-        </w:rPr>
-        <w:t xml:space="preserve">): Καταγράφει την αλληλουχία πατημάτων των 3 βιβλίων (σωστή σειρά: [0, 2, 1] δηλ. Αριστερό -&gt; Δεξί -&gt; Μεσαίο). Σε επιτυχία καλεί τη </w:t>
-      </w:r>
-      <w:r>
-        <w:rPr>
-          <w:rFonts w:ascii="Times New Roman" w:hAnsi="Times New Roman" w:cs="Times New Roman"/>
-        </w:rPr>
-        <w:t>reveal</w:t>
-      </w:r>
-      <w:r>
-        <w:rPr>
-          <w:rFonts w:ascii="Times New Roman" w:hAnsi="Times New Roman" w:cs="Times New Roman"/>
-          <w:lang w:val="el-GR"/>
-        </w:rPr>
-        <w:t>_</w:t>
-      </w:r>
-      <w:r>
-        <w:rPr>
-          <w:rFonts w:ascii="Times New Roman" w:hAnsi="Times New Roman" w:cs="Times New Roman"/>
-        </w:rPr>
-        <w:t>triangle</w:t>
-      </w:r>
-      <w:r>
-        <w:rPr>
-          <w:rFonts w:ascii="Times New Roman" w:hAnsi="Times New Roman" w:cs="Times New Roman"/>
-          <w:lang w:val="el-GR"/>
-        </w:rPr>
-        <w:t>_</w:t>
-      </w:r>
-      <w:r>
-        <w:rPr>
-          <w:rFonts w:ascii="Times New Roman" w:hAnsi="Times New Roman" w:cs="Times New Roman"/>
-        </w:rPr>
-        <w:t>puzzle</w:t>
-      </w:r>
-      <w:r>
-        <w:rPr>
-          <w:rFonts w:ascii="Times New Roman" w:hAnsi="Times New Roman" w:cs="Times New Roman"/>
-          <w:lang w:val="el-GR"/>
-        </w:rPr>
-        <w:t xml:space="preserve">(). Κατά το </w:t>
-      </w:r>
-      <w:r>
-        <w:rPr>
-          <w:rFonts w:ascii="Times New Roman" w:hAnsi="Times New Roman" w:cs="Times New Roman"/>
-        </w:rPr>
-        <w:t>reset</w:t>
-      </w:r>
-      <w:r>
-        <w:rPr>
-          <w:rFonts w:ascii="Times New Roman" w:hAnsi="Times New Roman" w:cs="Times New Roman"/>
-          <w:lang w:val="el-GR"/>
-        </w:rPr>
-        <w:t xml:space="preserve"> αγνοεί πατήματα (</w:t>
-      </w:r>
-      <w:r>
-        <w:rPr>
-          <w:rFonts w:ascii="Times New Roman" w:hAnsi="Times New Roman" w:cs="Times New Roman"/>
-        </w:rPr>
-        <w:t>is</w:t>
-      </w:r>
-      <w:r>
-        <w:rPr>
-          <w:rFonts w:ascii="Times New Roman" w:hAnsi="Times New Roman" w:cs="Times New Roman"/>
-          <w:lang w:val="el-GR"/>
-        </w:rPr>
-        <w:t>_</w:t>
-      </w:r>
-      <w:r>
-        <w:rPr>
-          <w:rFonts w:ascii="Times New Roman" w:hAnsi="Times New Roman" w:cs="Times New Roman"/>
-        </w:rPr>
-        <w:t>resetting</w:t>
-      </w:r>
-      <w:r>
-        <w:rPr>
-          <w:rFonts w:ascii="Times New Roman" w:hAnsi="Times New Roman" w:cs="Times New Roman"/>
-          <w:lang w:val="el-GR"/>
-        </w:rPr>
-        <w:t xml:space="preserve"> </w:t>
-      </w:r>
-      <w:r>
-        <w:rPr>
-          <w:rFonts w:ascii="Times New Roman" w:hAnsi="Times New Roman" w:cs="Times New Roman"/>
-        </w:rPr>
-        <w:t>flag</w:t>
-      </w:r>
-      <w:r>
-        <w:rPr>
-          <w:rFonts w:ascii="Times New Roman" w:hAnsi="Times New Roman" w:cs="Times New Roman"/>
-          <w:lang w:val="el-GR"/>
-        </w:rPr>
-        <w:t xml:space="preserve">) για αποφυγή </w:t>
-      </w:r>
-      <w:proofErr w:type="spellStart"/>
-      <w:r>
-        <w:rPr>
-          <w:rFonts w:ascii="Times New Roman" w:hAnsi="Times New Roman" w:cs="Times New Roman"/>
-          <w:lang w:val="el-GR"/>
-        </w:rPr>
-        <w:t>αποσυγχρονισμού</w:t>
-      </w:r>
-      <w:proofErr w:type="spellEnd"/>
-      <w:r>
-        <w:rPr>
-          <w:rFonts w:ascii="Times New Roman" w:hAnsi="Times New Roman" w:cs="Times New Roman"/>
-          <w:lang w:val="el-GR"/>
-        </w:rPr>
-        <w:t>.</w:t>
-      </w:r>
-      <w:r>
-        <w:rPr>
-          <w:rFonts w:ascii="Times New Roman" w:hAnsi="Times New Roman" w:cs="Times New Roman"/>
-          <w:lang w:val="el-GR"/>
-        </w:rPr>
-        <w:br/>
-        <w:t>• _</w:t>
-      </w:r>
-      <w:r>
-        <w:rPr>
-          <w:rFonts w:ascii="Times New Roman" w:hAnsi="Times New Roman" w:cs="Times New Roman"/>
-        </w:rPr>
-        <w:t>on</w:t>
-      </w:r>
-      <w:r>
-        <w:rPr>
-          <w:rFonts w:ascii="Times New Roman" w:hAnsi="Times New Roman" w:cs="Times New Roman"/>
-          <w:lang w:val="el-GR"/>
-        </w:rPr>
-        <w:t>_</w:t>
-      </w:r>
-      <w:r>
-        <w:rPr>
-          <w:rFonts w:ascii="Times New Roman" w:hAnsi="Times New Roman" w:cs="Times New Roman"/>
-        </w:rPr>
-        <w:t>piece</w:t>
-      </w:r>
-      <w:r>
-        <w:rPr>
-          <w:rFonts w:ascii="Times New Roman" w:hAnsi="Times New Roman" w:cs="Times New Roman"/>
-          <w:lang w:val="el-GR"/>
-        </w:rPr>
-        <w:t>_</w:t>
-      </w:r>
-      <w:r>
-        <w:rPr>
-          <w:rFonts w:ascii="Times New Roman" w:hAnsi="Times New Roman" w:cs="Times New Roman"/>
-        </w:rPr>
-        <w:t>interacted</w:t>
-      </w:r>
-      <w:r>
-        <w:rPr>
-          <w:rFonts w:ascii="Times New Roman" w:hAnsi="Times New Roman" w:cs="Times New Roman"/>
-          <w:lang w:val="el-GR"/>
-        </w:rPr>
-        <w:t>(</w:t>
-      </w:r>
-      <w:r>
-        <w:rPr>
-          <w:rFonts w:ascii="Times New Roman" w:hAnsi="Times New Roman" w:cs="Times New Roman"/>
-        </w:rPr>
-        <w:t>player</w:t>
-      </w:r>
-      <w:r>
-        <w:rPr>
-          <w:rFonts w:ascii="Times New Roman" w:hAnsi="Times New Roman" w:cs="Times New Roman"/>
-          <w:lang w:val="el-GR"/>
-        </w:rPr>
-        <w:t xml:space="preserve">, </w:t>
-      </w:r>
-      <w:r>
-        <w:rPr>
-          <w:rFonts w:ascii="Times New Roman" w:hAnsi="Times New Roman" w:cs="Times New Roman"/>
-        </w:rPr>
-        <w:t>index</w:t>
-      </w:r>
-      <w:r>
-        <w:rPr>
-          <w:rFonts w:ascii="Times New Roman" w:hAnsi="Times New Roman" w:cs="Times New Roman"/>
-          <w:lang w:val="el-GR"/>
-        </w:rPr>
-        <w:t xml:space="preserve">): Προσαυξάνει διακριτά τον πίνακα γωνιών </w:t>
-      </w:r>
-      <w:r>
-        <w:rPr>
-          <w:rFonts w:ascii="Times New Roman" w:hAnsi="Times New Roman" w:cs="Times New Roman"/>
-        </w:rPr>
-        <w:t>piece</w:t>
-      </w:r>
-      <w:r>
-        <w:rPr>
-          <w:rFonts w:ascii="Times New Roman" w:hAnsi="Times New Roman" w:cs="Times New Roman"/>
-          <w:lang w:val="el-GR"/>
-        </w:rPr>
-        <w:t>_</w:t>
-      </w:r>
-      <w:r>
-        <w:rPr>
-          <w:rFonts w:ascii="Times New Roman" w:hAnsi="Times New Roman" w:cs="Times New Roman"/>
-        </w:rPr>
-        <w:t>target</w:t>
-      </w:r>
-      <w:r>
-        <w:rPr>
-          <w:rFonts w:ascii="Times New Roman" w:hAnsi="Times New Roman" w:cs="Times New Roman"/>
-          <w:lang w:val="el-GR"/>
-        </w:rPr>
-        <w:t>_</w:t>
-      </w:r>
-      <w:r>
-        <w:rPr>
-          <w:rFonts w:ascii="Times New Roman" w:hAnsi="Times New Roman" w:cs="Times New Roman"/>
-        </w:rPr>
-        <w:t>angles</w:t>
-      </w:r>
-      <w:r>
-        <w:rPr>
-          <w:rFonts w:ascii="Times New Roman" w:hAnsi="Times New Roman" w:cs="Times New Roman"/>
-          <w:lang w:val="el-GR"/>
-        </w:rPr>
-        <w:t>[</w:t>
-      </w:r>
-      <w:r>
-        <w:rPr>
-          <w:rFonts w:ascii="Times New Roman" w:hAnsi="Times New Roman" w:cs="Times New Roman"/>
-        </w:rPr>
-        <w:t>index</w:t>
-      </w:r>
-      <w:r>
-        <w:rPr>
-          <w:rFonts w:ascii="Times New Roman" w:hAnsi="Times New Roman" w:cs="Times New Roman"/>
-          <w:lang w:val="el-GR"/>
-        </w:rPr>
-        <w:t xml:space="preserve">] κατά 60° και περιστρέφει τη ράβδο με </w:t>
-      </w:r>
-      <w:r>
-        <w:rPr>
-          <w:rFonts w:ascii="Times New Roman" w:hAnsi="Times New Roman" w:cs="Times New Roman"/>
-        </w:rPr>
-        <w:t>Tween</w:t>
-      </w:r>
-      <w:r>
-        <w:rPr>
-          <w:rFonts w:ascii="Times New Roman" w:hAnsi="Times New Roman" w:cs="Times New Roman"/>
-          <w:lang w:val="el-GR"/>
-        </w:rPr>
-        <w:t>, αποτρέποντας αποκλίσεις γωνιών σε γρήγορα κλικ.</w:t>
-      </w:r>
-      <w:r>
-        <w:rPr>
-          <w:rFonts w:ascii="Times New Roman" w:hAnsi="Times New Roman" w:cs="Times New Roman"/>
-          <w:lang w:val="el-GR"/>
-        </w:rPr>
-        <w:br/>
-        <w:t xml:space="preserve">• </w:t>
-      </w:r>
-      <w:r>
-        <w:rPr>
-          <w:rFonts w:ascii="Times New Roman" w:hAnsi="Times New Roman" w:cs="Times New Roman"/>
-        </w:rPr>
-        <w:t>check</w:t>
-      </w:r>
-      <w:r>
-        <w:rPr>
-          <w:rFonts w:ascii="Times New Roman" w:hAnsi="Times New Roman" w:cs="Times New Roman"/>
-          <w:lang w:val="el-GR"/>
-        </w:rPr>
-        <w:t>_</w:t>
-      </w:r>
-      <w:r>
-        <w:rPr>
-          <w:rFonts w:ascii="Times New Roman" w:hAnsi="Times New Roman" w:cs="Times New Roman"/>
-        </w:rPr>
-        <w:t>triangle</w:t>
-      </w:r>
-      <w:r>
-        <w:rPr>
-          <w:rFonts w:ascii="Times New Roman" w:hAnsi="Times New Roman" w:cs="Times New Roman"/>
-          <w:lang w:val="el-GR"/>
-        </w:rPr>
-        <w:t>_</w:t>
-      </w:r>
-      <w:r>
-        <w:rPr>
-          <w:rFonts w:ascii="Times New Roman" w:hAnsi="Times New Roman" w:cs="Times New Roman"/>
-        </w:rPr>
-        <w:t>puzzle</w:t>
-      </w:r>
-      <w:r>
-        <w:rPr>
-          <w:rFonts w:ascii="Times New Roman" w:hAnsi="Times New Roman" w:cs="Times New Roman"/>
-          <w:lang w:val="el-GR"/>
-        </w:rPr>
-        <w:t xml:space="preserve">(): Κατηγοριοποιεί τις γωνίες κάθε ράβδου σε 3 κλάσεις: Οριζόντια (0° / 180°), </w:t>
-      </w:r>
-      <w:r>
-        <w:rPr>
-          <w:rFonts w:ascii="Times New Roman" w:hAnsi="Times New Roman" w:cs="Times New Roman"/>
-        </w:rPr>
-        <w:t>Slash</w:t>
-      </w:r>
-      <w:r>
-        <w:rPr>
-          <w:rFonts w:ascii="Times New Roman" w:hAnsi="Times New Roman" w:cs="Times New Roman"/>
-          <w:lang w:val="el-GR"/>
-        </w:rPr>
-        <w:t xml:space="preserve"> / (60° / 240°), και </w:t>
-      </w:r>
-      <w:r>
-        <w:rPr>
-          <w:rFonts w:ascii="Times New Roman" w:hAnsi="Times New Roman" w:cs="Times New Roman"/>
-        </w:rPr>
-        <w:t>Backslash</w:t>
-      </w:r>
-      <w:r>
-        <w:rPr>
-          <w:rFonts w:ascii="Times New Roman" w:hAnsi="Times New Roman" w:cs="Times New Roman"/>
-          <w:lang w:val="el-GR"/>
-        </w:rPr>
-        <w:t xml:space="preserve"> \ (120° / 300°). Ελέγχει αν το σύνολο περιέχει ακριβώς μία ράβδο από κάθε κλάση (</w:t>
-      </w:r>
-      <w:r>
-        <w:rPr>
-          <w:rFonts w:ascii="Times New Roman" w:hAnsi="Times New Roman" w:cs="Times New Roman"/>
-        </w:rPr>
-        <w:t>types</w:t>
-      </w:r>
-      <w:r>
-        <w:rPr>
-          <w:rFonts w:ascii="Times New Roman" w:hAnsi="Times New Roman" w:cs="Times New Roman"/>
-          <w:lang w:val="el-GR"/>
-        </w:rPr>
-        <w:t>.</w:t>
-      </w:r>
-      <w:r>
-        <w:rPr>
-          <w:rFonts w:ascii="Times New Roman" w:hAnsi="Times New Roman" w:cs="Times New Roman"/>
-        </w:rPr>
-        <w:t>sort</w:t>
-      </w:r>
-      <w:r>
-        <w:rPr>
-          <w:rFonts w:ascii="Times New Roman" w:hAnsi="Times New Roman" w:cs="Times New Roman"/>
-          <w:lang w:val="el-GR"/>
-        </w:rPr>
-        <w:t>() == [0, 1, 2]), αναγνωρίζοντας οποιαδήποτε έγκυρη γεωμετρική σύνθεση.</w:t>
-      </w:r>
-      <w:r>
-        <w:rPr>
-          <w:rFonts w:ascii="Times New Roman" w:hAnsi="Times New Roman" w:cs="Times New Roman"/>
-          <w:lang w:val="el-GR"/>
-        </w:rPr>
-        <w:br/>
-        <w:t>• _</w:t>
-      </w:r>
-      <w:r>
-        <w:rPr>
-          <w:rFonts w:ascii="Times New Roman" w:hAnsi="Times New Roman" w:cs="Times New Roman"/>
-        </w:rPr>
-        <w:t>on</w:t>
-      </w:r>
-      <w:r>
-        <w:rPr>
-          <w:rFonts w:ascii="Times New Roman" w:hAnsi="Times New Roman" w:cs="Times New Roman"/>
-          <w:lang w:val="el-GR"/>
-        </w:rPr>
-        <w:t>_</w:t>
-      </w:r>
-      <w:r>
-        <w:rPr>
-          <w:rFonts w:ascii="Times New Roman" w:hAnsi="Times New Roman" w:cs="Times New Roman"/>
-        </w:rPr>
-        <w:t>access</w:t>
-      </w:r>
-      <w:r>
-        <w:rPr>
-          <w:rFonts w:ascii="Times New Roman" w:hAnsi="Times New Roman" w:cs="Times New Roman"/>
-          <w:lang w:val="el-GR"/>
-        </w:rPr>
-        <w:t>_</w:t>
-      </w:r>
-      <w:r>
-        <w:rPr>
-          <w:rFonts w:ascii="Times New Roman" w:hAnsi="Times New Roman" w:cs="Times New Roman"/>
-        </w:rPr>
-        <w:t>panel</w:t>
-      </w:r>
-      <w:r>
-        <w:rPr>
-          <w:rFonts w:ascii="Times New Roman" w:hAnsi="Times New Roman" w:cs="Times New Roman"/>
-          <w:lang w:val="el-GR"/>
-        </w:rPr>
-        <w:t>_</w:t>
-      </w:r>
-      <w:r>
-        <w:rPr>
-          <w:rFonts w:ascii="Times New Roman" w:hAnsi="Times New Roman" w:cs="Times New Roman"/>
-        </w:rPr>
-        <w:t>interacted</w:t>
-      </w:r>
-      <w:r>
-        <w:rPr>
-          <w:rFonts w:ascii="Times New Roman" w:hAnsi="Times New Roman" w:cs="Times New Roman"/>
-          <w:lang w:val="el-GR"/>
-        </w:rPr>
-        <w:t>(</w:t>
-      </w:r>
-      <w:r>
-        <w:rPr>
-          <w:rFonts w:ascii="Times New Roman" w:hAnsi="Times New Roman" w:cs="Times New Roman"/>
-        </w:rPr>
-        <w:t>player</w:t>
-      </w:r>
-      <w:r>
-        <w:rPr>
-          <w:rFonts w:ascii="Times New Roman" w:hAnsi="Times New Roman" w:cs="Times New Roman"/>
-          <w:lang w:val="el-GR"/>
-        </w:rPr>
-        <w:t xml:space="preserve">): Ενεργοποιεί </w:t>
-      </w:r>
-      <w:r>
-        <w:rPr>
-          <w:rFonts w:ascii="Times New Roman" w:hAnsi="Times New Roman" w:cs="Times New Roman"/>
-        </w:rPr>
-        <w:t>Tween</w:t>
-      </w:r>
-      <w:r>
-        <w:rPr>
-          <w:rFonts w:ascii="Times New Roman" w:hAnsi="Times New Roman" w:cs="Times New Roman"/>
-          <w:lang w:val="el-GR"/>
-        </w:rPr>
-        <w:t xml:space="preserve"> περιστροφής 90° στον μεντεσέ της μυστικής πόρτας (</w:t>
-      </w:r>
-      <w:r>
-        <w:rPr>
-          <w:rFonts w:ascii="Times New Roman" w:hAnsi="Times New Roman" w:cs="Times New Roman"/>
-        </w:rPr>
-        <w:t>exit</w:t>
-      </w:r>
-      <w:r>
-        <w:rPr>
-          <w:rFonts w:ascii="Times New Roman" w:hAnsi="Times New Roman" w:cs="Times New Roman"/>
-          <w:lang w:val="el-GR"/>
-        </w:rPr>
-        <w:t>_</w:t>
-      </w:r>
-      <w:r>
-        <w:rPr>
-          <w:rFonts w:ascii="Times New Roman" w:hAnsi="Times New Roman" w:cs="Times New Roman"/>
-        </w:rPr>
-        <w:t>door</w:t>
-      </w:r>
-      <w:r>
-        <w:rPr>
-          <w:rFonts w:ascii="Times New Roman" w:hAnsi="Times New Roman" w:cs="Times New Roman"/>
-          <w:lang w:val="el-GR"/>
-        </w:rPr>
-        <w:t>_</w:t>
-      </w:r>
-      <w:r>
-        <w:rPr>
-          <w:rFonts w:ascii="Times New Roman" w:hAnsi="Times New Roman" w:cs="Times New Roman"/>
-        </w:rPr>
-        <w:t>pivot</w:t>
-      </w:r>
-      <w:r>
-        <w:rPr>
-          <w:rFonts w:ascii="Times New Roman" w:hAnsi="Times New Roman" w:cs="Times New Roman"/>
-          <w:lang w:val="el-GR"/>
-        </w:rPr>
-        <w:t>).</w:t>
+        <w:t>Το project αποτελείται από 3 scripts (player.gd, game_manager.gd, interactable.gd), και παρουσιάζονται αναλυτικά και τα 3 παρακάτω. Η εκφώνηση ζητά την παρουσίαση των 4-5 σημαντικότερων scripts· επειδή το project έχει συνολικά 3, παρουσιάζονται όλα.</w:t>
+        <w:br/>
+        <w:br/>
+        <w:t>1. player.gd – First-Person Controller &amp; Dynamic Feedback:</w:t>
+        <w:br/>
+        <w:t>• _input(event): Επεξεργάζεται την κίνηση του ποντικιού με pitch accumulator (clamp -80° έως +80°) εξαλείφοντας πλήρως σφάλματα gimbal lock ή NaN κατά τη συνεχή περιστροφή.</w:t>
+        <w:br/>
+        <w:t>• _unhandled_input(event): Ελέγχει το φυσικό πλήκτρο (event.physical_keycode == KEY_E) ή το αριστερό κλικ ποντικιού. Ενεργοποιεί Tween στο HandPivot για κίνηση απλώματος (forward translation σε 0.1s και return σε 0.15s) με ασφαλή ανακύκλωση (tween.kill()).</w:t>
+        <w:br/>
+        <w:t>• _physics_process(delta): Υπολογίζει την κίνηση μέσω transform.basis και move_and_slide(). Ελέγχει την ακτίνα raycast.is_colliding() (εμβέλεια 3.0m) και ενημερώνει το InteractionPrompt καθώς και το Crosshair σε χρυσό εικονίδιο ✋.</w:t>
+        <w:br/>
+        <w:t>• escape(body): Καλείται κατά την είσοδο στην περιοχή εξόδου με προστασία διπλής κλήσης (has_escaped flag), εμφανίζει την οθόνη νίκης για 3 δευτερόλεπτα και τερματίζει την εφαρμογή με get_tree().quit().</w:t>
+        <w:br/>
+        <w:br/>
+        <w:t>2. game_manager.gd – Puzzle Logic &amp; Permutation Math:</w:t>
+        <w:br/>
+        <w:t>• _on_switch_interacted(player, index): Καταγράφει την αλληλουχία πατημάτων των 3 βιβλίων (σωστή σειρά: [0, 2, 1] δηλ. Αριστερό -&gt; Δεξί -&gt; Μεσαίο). Σε επιτυχία καλεί τη reveal_triangle_puzzle(). Κατά το reset αγνοεί πατήματα (is_resetting flag) για αποφυγή αποσυγχρονισμού.</w:t>
+        <w:br/>
+        <w:t>• _on_piece_interacted(player, index): Προσαυξάνει διακριτά τον πίνακα γωνιών piece_target_angles[index] κατά 60° και περιστρέφει τη ράβδο με Tween, αποτρέποντας αποκλίσεις γωνιών σε γρήγορα κλικ.</w:t>
+        <w:br/>
+        <w:t>• check_triangle_puzzle(): Κατηγοριοποιεί τις γωνίες κάθε ράβδου σε 3 κλάσεις: Οριζόντια (0° / 180°), Slash / (60° / 240°), και Backslash \ (120° / 300°). Ελέγχει αν το σύνολο περιέχει ακριβώς μία ράβδο από κάθε κλάση (types.sort() == [0, 1, 2]), αναγνωρίζοντας οποιαδήποτε έγκυρη γεωμετρική σύνθεση.</w:t>
+        <w:br/>
+        <w:t>• _on_access_panel_interacted(player): Ενεργοποιεί Tween περιστροφής 90° στον μεντεσέ της μυστικής πόρτας (exit_door_pivot).</w:t>
+        <w:br/>
+        <w:br/>
+        <w:t>3. interactable.gd – Modular Interaction Base Class:</w:t>
+        <w:br/>
+        <w:t>• class_name Interactable extends StaticBody3D: Παρέχει μια ελαφριά, επαναχρησιμοποιήσιμη κλάση βάσης για κάθε διαδραστικό στοιχείο του χώρου (βιβλία, ράβδοι, μυστικός θυρεός).</w:t>
+        <w:br/>
+        <w:t>• @export var prompt_message: String = "[E] Interact": Καθορίζει το δυναμικό μήνυμα προτροπής που εμφανίζεται στο κεντρικό HUD όταν ο παίκτης σημαδεύει το αντικείμενο.</w:t>
+        <w:br/>
+        <w:t>• @export var is_interactive: bool = true: Επιτρέπει την άμεση ενεργοποίηση ή απενεργοποίηση της δυνατότητας αλληλεπίδρασης ανάλογα με την κατάσταση του παιχνιδιού.</w:t>
+        <w:br/>
+        <w:t>• signal interacted(player): Εκπέμπεται κατά την κλήση της interact(player), επιτυγχάνοντας πλήρη αποσύνδεση (signals decoupling) της ανίχνευσης από τη λογική των γρίφων.</w:t>
       </w:r>
     </w:p>
     <w:p>
@@ -6170,355 +4542,15 @@
         </w:rPr>
       </w:pPr>
       <w:r>
-        <w:rPr>
-          <w:rFonts w:ascii="Times New Roman" w:hAnsi="Times New Roman" w:cs="Times New Roman"/>
-          <w:lang w:val="el-GR"/>
-        </w:rPr>
-        <w:t xml:space="preserve">• Στοιχεία που διδάχθηκαν &amp; </w:t>
-      </w:r>
-      <w:r>
-        <w:rPr>
-          <w:rFonts w:ascii="Times New Roman" w:hAnsi="Times New Roman" w:cs="Times New Roman"/>
-        </w:rPr>
-        <w:t>Optimization</w:t>
-      </w:r>
-      <w:r>
-        <w:rPr>
-          <w:rFonts w:ascii="Times New Roman" w:hAnsi="Times New Roman" w:cs="Times New Roman"/>
-          <w:lang w:val="el-GR"/>
-        </w:rPr>
-        <w:t xml:space="preserve">: Χρήση του σύγχρονου </w:t>
-      </w:r>
-      <w:r>
-        <w:rPr>
-          <w:rFonts w:ascii="Times New Roman" w:hAnsi="Times New Roman" w:cs="Times New Roman"/>
-        </w:rPr>
-        <w:t>Jolt</w:t>
-      </w:r>
-      <w:r>
-        <w:rPr>
-          <w:rFonts w:ascii="Times New Roman" w:hAnsi="Times New Roman" w:cs="Times New Roman"/>
-          <w:lang w:val="el-GR"/>
-        </w:rPr>
-        <w:t xml:space="preserve"> </w:t>
-      </w:r>
-      <w:r>
-        <w:rPr>
-          <w:rFonts w:ascii="Times New Roman" w:hAnsi="Times New Roman" w:cs="Times New Roman"/>
-        </w:rPr>
-        <w:t>Physics</w:t>
-      </w:r>
-      <w:r>
-        <w:rPr>
-          <w:rFonts w:ascii="Times New Roman" w:hAnsi="Times New Roman" w:cs="Times New Roman"/>
-          <w:lang w:val="el-GR"/>
-        </w:rPr>
-        <w:t xml:space="preserve"> </w:t>
-      </w:r>
-      <w:r>
-        <w:rPr>
-          <w:rFonts w:ascii="Times New Roman" w:hAnsi="Times New Roman" w:cs="Times New Roman"/>
-        </w:rPr>
-        <w:t>Engine</w:t>
-      </w:r>
-      <w:r>
-        <w:rPr>
-          <w:rFonts w:ascii="Times New Roman" w:hAnsi="Times New Roman" w:cs="Times New Roman"/>
-          <w:lang w:val="el-GR"/>
-        </w:rPr>
-        <w:t xml:space="preserve"> της </w:t>
-      </w:r>
-      <w:r>
-        <w:rPr>
-          <w:rFonts w:ascii="Times New Roman" w:hAnsi="Times New Roman" w:cs="Times New Roman"/>
-        </w:rPr>
-        <w:t>Godot</w:t>
-      </w:r>
-      <w:r>
-        <w:rPr>
-          <w:rFonts w:ascii="Times New Roman" w:hAnsi="Times New Roman" w:cs="Times New Roman"/>
-          <w:lang w:val="el-GR"/>
-        </w:rPr>
-        <w:t xml:space="preserve"> 4, ελαχιστοποίηση </w:t>
-      </w:r>
-      <w:r>
-        <w:rPr>
-          <w:rFonts w:ascii="Times New Roman" w:hAnsi="Times New Roman" w:cs="Times New Roman"/>
-        </w:rPr>
-        <w:t>draw</w:t>
-      </w:r>
-      <w:r>
-        <w:rPr>
-          <w:rFonts w:ascii="Times New Roman" w:hAnsi="Times New Roman" w:cs="Times New Roman"/>
-          <w:lang w:val="el-GR"/>
-        </w:rPr>
-        <w:t xml:space="preserve"> </w:t>
-      </w:r>
-      <w:r>
-        <w:rPr>
-          <w:rFonts w:ascii="Times New Roman" w:hAnsi="Times New Roman" w:cs="Times New Roman"/>
-        </w:rPr>
-        <w:t>calls</w:t>
-      </w:r>
-      <w:r>
-        <w:rPr>
-          <w:rFonts w:ascii="Times New Roman" w:hAnsi="Times New Roman" w:cs="Times New Roman"/>
-          <w:lang w:val="el-GR"/>
-        </w:rPr>
-        <w:t xml:space="preserve"> μέσω </w:t>
-      </w:r>
-      <w:r>
-        <w:rPr>
-          <w:rFonts w:ascii="Times New Roman" w:hAnsi="Times New Roman" w:cs="Times New Roman"/>
-        </w:rPr>
-        <w:t>procedural</w:t>
-      </w:r>
-      <w:r>
-        <w:rPr>
-          <w:rFonts w:ascii="Times New Roman" w:hAnsi="Times New Roman" w:cs="Times New Roman"/>
-          <w:lang w:val="el-GR"/>
-        </w:rPr>
-        <w:t xml:space="preserve"> </w:t>
-      </w:r>
-      <w:r>
-        <w:rPr>
-          <w:rFonts w:ascii="Times New Roman" w:hAnsi="Times New Roman" w:cs="Times New Roman"/>
-        </w:rPr>
-        <w:t>primitives</w:t>
-      </w:r>
-      <w:r>
-        <w:rPr>
-          <w:rFonts w:ascii="Times New Roman" w:hAnsi="Times New Roman" w:cs="Times New Roman"/>
-          <w:lang w:val="el-GR"/>
-        </w:rPr>
-        <w:t xml:space="preserve"> και ενιαίων </w:t>
-      </w:r>
-      <w:r>
-        <w:rPr>
-          <w:rFonts w:ascii="Times New Roman" w:hAnsi="Times New Roman" w:cs="Times New Roman"/>
-        </w:rPr>
-        <w:t>PBR</w:t>
-      </w:r>
-      <w:r>
-        <w:rPr>
-          <w:rFonts w:ascii="Times New Roman" w:hAnsi="Times New Roman" w:cs="Times New Roman"/>
-          <w:lang w:val="el-GR"/>
-        </w:rPr>
-        <w:t xml:space="preserve"> </w:t>
-      </w:r>
-      <w:r>
-        <w:rPr>
-          <w:rFonts w:ascii="Times New Roman" w:hAnsi="Times New Roman" w:cs="Times New Roman"/>
-        </w:rPr>
-        <w:t>materials</w:t>
-      </w:r>
-      <w:r>
-        <w:rPr>
-          <w:rFonts w:ascii="Times New Roman" w:hAnsi="Times New Roman" w:cs="Times New Roman"/>
-          <w:lang w:val="el-GR"/>
-        </w:rPr>
-        <w:t xml:space="preserve">, αποδοτική διαχείριση </w:t>
-      </w:r>
-      <w:r>
-        <w:rPr>
-          <w:rFonts w:ascii="Times New Roman" w:hAnsi="Times New Roman" w:cs="Times New Roman"/>
-        </w:rPr>
-        <w:t>collision</w:t>
-      </w:r>
-      <w:r>
-        <w:rPr>
-          <w:rFonts w:ascii="Times New Roman" w:hAnsi="Times New Roman" w:cs="Times New Roman"/>
-          <w:lang w:val="el-GR"/>
-        </w:rPr>
-        <w:t xml:space="preserve"> </w:t>
-      </w:r>
-      <w:r>
-        <w:rPr>
-          <w:rFonts w:ascii="Times New Roman" w:hAnsi="Times New Roman" w:cs="Times New Roman"/>
-        </w:rPr>
-        <w:t>masks</w:t>
-      </w:r>
-      <w:r>
-        <w:rPr>
-          <w:rFonts w:ascii="Times New Roman" w:hAnsi="Times New Roman" w:cs="Times New Roman"/>
-          <w:lang w:val="el-GR"/>
-        </w:rPr>
-        <w:t xml:space="preserve"> και καθαρός κώδικας χωρίς </w:t>
-      </w:r>
-      <w:r>
-        <w:rPr>
-          <w:rFonts w:ascii="Times New Roman" w:hAnsi="Times New Roman" w:cs="Times New Roman"/>
-        </w:rPr>
-        <w:t>polling</w:t>
-      </w:r>
-      <w:r>
-        <w:rPr>
-          <w:rFonts w:ascii="Times New Roman" w:hAnsi="Times New Roman" w:cs="Times New Roman"/>
-          <w:lang w:val="el-GR"/>
-        </w:rPr>
-        <w:t xml:space="preserve"> </w:t>
-      </w:r>
-      <w:r>
-        <w:rPr>
-          <w:rFonts w:ascii="Times New Roman" w:hAnsi="Times New Roman" w:cs="Times New Roman"/>
-        </w:rPr>
-        <w:t>loops</w:t>
-      </w:r>
-      <w:r>
-        <w:rPr>
-          <w:rFonts w:ascii="Times New Roman" w:hAnsi="Times New Roman" w:cs="Times New Roman"/>
-          <w:lang w:val="el-GR"/>
-        </w:rPr>
-        <w:t>.</w:t>
-      </w:r>
-      <w:r>
-        <w:rPr>
-          <w:rFonts w:ascii="Times New Roman" w:hAnsi="Times New Roman" w:cs="Times New Roman"/>
-          <w:lang w:val="el-GR"/>
-        </w:rPr>
+        <w:t>• Στοιχεία που διδάχθηκαν &amp; Optimization: Χρήση της σύγχρονης μηχανής Jolt Physics της Godot 4 για αξιόπιστη και ταχύτατη ανίχνευση συγκρούσεων. Επίτευξη μόλις 68 Draw Calls και 89 ορατών αντικειμένων ανά frame (-55% έναντι της naive προσέγγισης) μέσω MultiMesh instancing 240 βιβλίων σε 1 ενιαία κλήση, διαμοιρασμού κοινών StandardMaterial3D (ξύλο, μέταλλο), επιλεκτικής σκίασης σε ένα μόνο φως (RoomLight) με εξοικονόμηση 18 cubemap shadow passes, σταθερού ρυθμού 108.5 FPS (χωρίς V-Sync) / 60 FPS (V-Sync), και πλήρους εξάλειψης του blocking disk I/O.</w:t>
         <w:br/>
         <w:t>• Αληθοφάνεια &amp; Αισθητική: Ζεστός ατμοσφαιρικός φωτισμός, σκούρο ξύλο μαόνι, μπρούτζινα μέταλλα και συνεκτική θεματολογία μυστικής βιβλιοθήκης.</w:t>
-      </w:r>
-      <w:r>
-        <w:rPr>
-          <w:rFonts w:ascii="Times New Roman" w:hAnsi="Times New Roman" w:cs="Times New Roman"/>
-          <w:lang w:val="el-GR"/>
-        </w:rPr>
-        <w:br/>
-        <w:t xml:space="preserve">• Πληρότητα &amp; Χρηστικότητα: Πλήρης ροή παιχνιδιού από την αρχή μέχρι την απόδραση και τον τερματισμό, με δυναμικό </w:t>
-      </w:r>
-      <w:r>
-        <w:rPr>
-          <w:rFonts w:ascii="Times New Roman" w:hAnsi="Times New Roman" w:cs="Times New Roman"/>
-        </w:rPr>
-        <w:t>crosshair</w:t>
-      </w:r>
-      <w:r>
-        <w:rPr>
-          <w:rFonts w:ascii="Times New Roman" w:hAnsi="Times New Roman" w:cs="Times New Roman"/>
-          <w:lang w:val="el-GR"/>
-        </w:rPr>
-        <w:t xml:space="preserve"> και σαφείς προτροπές.</w:t>
-      </w:r>
-      <w:r>
-        <w:rPr>
-          <w:rFonts w:ascii="Times New Roman" w:hAnsi="Times New Roman" w:cs="Times New Roman"/>
-          <w:lang w:val="el-GR"/>
-        </w:rPr>
-        <w:br/>
-        <w:t>• Κίνηση (</w:t>
-      </w:r>
-      <w:r>
-        <w:rPr>
-          <w:rFonts w:ascii="Times New Roman" w:hAnsi="Times New Roman" w:cs="Times New Roman"/>
-        </w:rPr>
-        <w:t>Animation</w:t>
-      </w:r>
-      <w:r>
-        <w:rPr>
-          <w:rFonts w:ascii="Times New Roman" w:hAnsi="Times New Roman" w:cs="Times New Roman"/>
-          <w:lang w:val="el-GR"/>
-        </w:rPr>
-        <w:t xml:space="preserve">): Ομαλά </w:t>
-      </w:r>
-      <w:r>
-        <w:rPr>
-          <w:rFonts w:ascii="Times New Roman" w:hAnsi="Times New Roman" w:cs="Times New Roman"/>
-        </w:rPr>
-        <w:t>Tween</w:t>
-      </w:r>
-      <w:r>
-        <w:rPr>
-          <w:rFonts w:ascii="Times New Roman" w:hAnsi="Times New Roman" w:cs="Times New Roman"/>
-          <w:lang w:val="el-GR"/>
-        </w:rPr>
-        <w:t xml:space="preserve"> </w:t>
-      </w:r>
-      <w:r>
-        <w:rPr>
-          <w:rFonts w:ascii="Times New Roman" w:hAnsi="Times New Roman" w:cs="Times New Roman"/>
-        </w:rPr>
-        <w:t>animations</w:t>
-      </w:r>
-      <w:r>
-        <w:rPr>
-          <w:rFonts w:ascii="Times New Roman" w:hAnsi="Times New Roman" w:cs="Times New Roman"/>
-          <w:lang w:val="el-GR"/>
-        </w:rPr>
-        <w:t xml:space="preserve"> σε πόρτες, βιβλία, ράβδους και στο 3</w:t>
-      </w:r>
-      <w:r>
-        <w:rPr>
-          <w:rFonts w:ascii="Times New Roman" w:hAnsi="Times New Roman" w:cs="Times New Roman"/>
-        </w:rPr>
-        <w:t>D</w:t>
-      </w:r>
-      <w:r>
-        <w:rPr>
-          <w:rFonts w:ascii="Times New Roman" w:hAnsi="Times New Roman" w:cs="Times New Roman"/>
-          <w:lang w:val="el-GR"/>
-        </w:rPr>
-        <w:t xml:space="preserve"> ανθρώπινο χέρι πρώτου προσώπου.</w:t>
-      </w:r>
-      <w:r>
-        <w:rPr>
-          <w:rFonts w:ascii="Times New Roman" w:hAnsi="Times New Roman" w:cs="Times New Roman"/>
-          <w:lang w:val="el-GR"/>
-        </w:rPr>
-        <w:br/>
-        <w:t xml:space="preserve">• Δομή &amp; Λογική Αλληλεπίδρασης: Αρχιτεκτονική δύο διαδοχικών σταδίων γρίφων, ασύγχρονη επικοινωνία με </w:t>
-      </w:r>
-      <w:r>
-        <w:rPr>
-          <w:rFonts w:ascii="Times New Roman" w:hAnsi="Times New Roman" w:cs="Times New Roman"/>
-        </w:rPr>
-        <w:t>Godot</w:t>
-      </w:r>
-      <w:r>
-        <w:rPr>
-          <w:rFonts w:ascii="Times New Roman" w:hAnsi="Times New Roman" w:cs="Times New Roman"/>
-          <w:lang w:val="el-GR"/>
-        </w:rPr>
-        <w:t xml:space="preserve"> </w:t>
-      </w:r>
-      <w:r>
-        <w:rPr>
-          <w:rFonts w:ascii="Times New Roman" w:hAnsi="Times New Roman" w:cs="Times New Roman"/>
-        </w:rPr>
-        <w:t>Signals</w:t>
-      </w:r>
-      <w:r>
-        <w:rPr>
-          <w:rFonts w:ascii="Times New Roman" w:hAnsi="Times New Roman" w:cs="Times New Roman"/>
-          <w:lang w:val="el-GR"/>
-        </w:rPr>
-        <w:t xml:space="preserve">, αλεξίσφαιρη προστασία κατά του </w:t>
-      </w:r>
-      <w:r>
-        <w:rPr>
-          <w:rFonts w:ascii="Times New Roman" w:hAnsi="Times New Roman" w:cs="Times New Roman"/>
-        </w:rPr>
-        <w:t>click</w:t>
-      </w:r>
-      <w:r>
-        <w:rPr>
-          <w:rFonts w:ascii="Times New Roman" w:hAnsi="Times New Roman" w:cs="Times New Roman"/>
-          <w:lang w:val="el-GR"/>
-        </w:rPr>
-        <w:t>-</w:t>
-      </w:r>
-      <w:r>
-        <w:rPr>
-          <w:rFonts w:ascii="Times New Roman" w:hAnsi="Times New Roman" w:cs="Times New Roman"/>
-        </w:rPr>
-        <w:t>spamming</w:t>
-      </w:r>
-      <w:r>
-        <w:rPr>
-          <w:rFonts w:ascii="Times New Roman" w:hAnsi="Times New Roman" w:cs="Times New Roman"/>
-          <w:lang w:val="el-GR"/>
-        </w:rPr>
-        <w:t xml:space="preserve"> και πλήρης σχολιασμός κώδικα.</w:t>
+        <w:br/>
+        <w:t>• Πληρότητα &amp; Χρηστικότητα: Πλήρης ροή παιχνιδιού από την αρχή μέχρι την απόδραση και τον τερματισμό, με δυναμικό crosshair και σαφείς προτροπές.</w:t>
+        <w:br/>
+        <w:t>• Κίνηση (Animation): Ομαλά Tween animations σε πόρτες, βιβλία, ράβδους και στο 3D ανθρώπινο χέρι πρώτου προσώπου.</w:t>
+        <w:br/>
+        <w:t>• Δομή &amp; Λογική Αλληλεπίδρασης: Αρχιτεκτονική δύο διαδοχικών σταδίων γρίφων, ασύγχρονη επικοινωνία με Godot Signals, αλεξίσφαιρη προστασία κατά του click-spamming και πλήρης σχολιασμός κώδικα.</w:t>
       </w:r>
     </w:p>
     <w:sectPr>

</xml_diff>